<commit_message>
Update FF Master Mini manual and sync workflow
</commit_message>
<xml_diff>
--- a/input/FF_Master_Mini_User_Manual.docx
+++ b/input/FF_Master_Mini_User_Manual.docx
@@ -1346,9 +1346,13 @@
           </w:tcPr>
           <w:p>
             <w:pPr>
-              <w:bidi w:val="0"/>
-              <w:spacing w:before="0" w:beforeAutospacing="0" w:after="0" w:afterAutospacing="0" w:line="300" w:lineRule="auto"/>
+              <w:suppressLineNumbers w:val="0"/>
+              <w:bidi w:val="0"/>
+              <w:spacing w:before="0" w:beforeAutospacing="0" w:after="0" w:afterAutospacing="0" w:line="300" w:lineRule="auto"/>
+              <w:ind w:left="0" w:right="0"/>
               <w:jc w:val="left"/>
+            </w:pPr>
+            <w:r>
               <w:rPr>
                 <w:rFonts w:ascii="微软雅黑" w:hAnsi="微软雅黑" w:eastAsia="微软雅黑" w:cs="微软雅黑"/>
                 <w:b/>
@@ -1357,18 +1361,33 @@
                 <w:iCs w:val="0"/>
                 <w:caps w:val="0"/>
                 <w:smallCaps w:val="0"/>
-                <w:color w:val="262626" w:themeColor="text1" w:themeTint="D9"/>
+                <w:color w:val="000000" w:themeColor="text1" w:themeTint="FF"/>
                 <w:sz w:val="21"/>
                 <w:szCs w:val="21"/>
                 <w14:textFill>
                   <w14:solidFill>
                     <w14:schemeClr w14:val="tx1">
-                      <w14:lumMod w14:val="85000"/>
-                      <w14:lumOff w14:val="15000"/>
+                      <w14:lumMod w14:val="100000"/>
+                      <w14:lumOff w14:val="0"/>
                     </w14:schemeClr>
                   </w14:solidFill>
                 </w14:textFill>
               </w:rPr>
+              <w:t>Master Mini</w:t>
+            </w:r>
+          </w:p>
+        </w:tc>
+        <w:tc>
+          <w:tcPr>
+            <w:tcW w:w="1660" w:type="dxa"/>
+          </w:tcPr>
+          <w:p>
+            <w:pPr>
+              <w:suppressLineNumbers w:val="0"/>
+              <w:bidi w:val="0"/>
+              <w:spacing w:before="0" w:beforeAutospacing="0" w:after="0" w:afterAutospacing="0" w:line="300" w:lineRule="auto"/>
+              <w:ind w:left="0" w:right="0"/>
+              <w:jc w:val="left"/>
             </w:pPr>
             <w:r>
               <w:rPr>
@@ -1379,31 +1398,35 @@
                 <w:iCs w:val="0"/>
                 <w:caps w:val="0"/>
                 <w:smallCaps w:val="0"/>
-                <w:color w:val="262626" w:themeColor="text1" w:themeTint="D9"/>
+                <w:color w:val="000000" w:themeColor="text1" w:themeTint="FF"/>
                 <w:sz w:val="21"/>
                 <w:szCs w:val="21"/>
                 <w14:textFill>
                   <w14:solidFill>
                     <w14:schemeClr w14:val="tx1">
-                      <w14:lumMod w14:val="85000"/>
-                      <w14:lumOff w14:val="15000"/>
+                      <w14:lumMod w14:val="100000"/>
+                      <w14:lumOff w14:val="0"/>
                     </w14:schemeClr>
                   </w14:solidFill>
                 </w14:textFill>
               </w:rPr>
-              <w:t>Geek</w:t>
-            </w:r>
-          </w:p>
-        </w:tc>
-        <w:tc>
-          <w:tcPr>
-            <w:tcW w:w="1660" w:type="dxa"/>
-          </w:tcPr>
-          <w:p>
-            <w:pPr>
-              <w:bidi w:val="0"/>
-              <w:spacing w:before="0" w:beforeAutospacing="0" w:after="0" w:afterAutospacing="0" w:line="300" w:lineRule="auto"/>
+              <w:t>Master Mini Pro</w:t>
+            </w:r>
+          </w:p>
+        </w:tc>
+        <w:tc>
+          <w:tcPr>
+            <w:tcW w:w="2030" w:type="dxa"/>
+          </w:tcPr>
+          <w:p>
+            <w:pPr>
+              <w:suppressLineNumbers w:val="0"/>
+              <w:bidi w:val="0"/>
+              <w:spacing w:before="0" w:beforeAutospacing="0" w:after="0" w:afterAutospacing="0" w:line="300" w:lineRule="auto"/>
+              <w:ind w:left="0" w:right="0"/>
               <w:jc w:val="left"/>
+            </w:pPr>
+            <w:r>
               <w:rPr>
                 <w:rFonts w:ascii="微软雅黑" w:hAnsi="微软雅黑" w:eastAsia="微软雅黑" w:cs="微软雅黑"/>
                 <w:b/>
@@ -1412,96 +1435,19 @@
                 <w:iCs w:val="0"/>
                 <w:caps w:val="0"/>
                 <w:smallCaps w:val="0"/>
-                <w:color w:val="262626" w:themeColor="text1" w:themeTint="D9"/>
+                <w:color w:val="000000" w:themeColor="text1" w:themeTint="FF"/>
                 <w:sz w:val="21"/>
                 <w:szCs w:val="21"/>
                 <w14:textFill>
                   <w14:solidFill>
                     <w14:schemeClr w14:val="tx1">
-                      <w14:lumMod w14:val="85000"/>
-                      <w14:lumOff w14:val="15000"/>
+                      <w14:lumMod w14:val="100000"/>
+                      <w14:lumOff w14:val="0"/>
                     </w14:schemeClr>
                   </w14:solidFill>
                 </w14:textFill>
               </w:rPr>
-            </w:pPr>
-            <w:r>
-              <w:rPr>
-                <w:rFonts w:ascii="微软雅黑" w:hAnsi="微软雅黑" w:eastAsia="微软雅黑" w:cs="微软雅黑"/>
-                <w:b/>
-                <w:bCs/>
-                <w:i w:val="0"/>
-                <w:iCs w:val="0"/>
-                <w:caps w:val="0"/>
-                <w:smallCaps w:val="0"/>
-                <w:color w:val="262626" w:themeColor="text1" w:themeTint="D9"/>
-                <w:sz w:val="21"/>
-                <w:szCs w:val="21"/>
-                <w14:textFill>
-                  <w14:solidFill>
-                    <w14:schemeClr w14:val="tx1">
-                      <w14:lumMod w14:val="85000"/>
-                      <w14:lumOff w14:val="15000"/>
-                    </w14:schemeClr>
-                  </w14:solidFill>
-                </w14:textFill>
-              </w:rPr>
-              <w:t>Education</w:t>
-            </w:r>
-          </w:p>
-        </w:tc>
-        <w:tc>
-          <w:tcPr>
-            <w:tcW w:w="2030" w:type="dxa"/>
-          </w:tcPr>
-          <w:p>
-            <w:pPr>
-              <w:bidi w:val="0"/>
-              <w:spacing w:before="0" w:beforeAutospacing="0" w:after="0" w:afterAutospacing="0" w:line="300" w:lineRule="auto"/>
-              <w:jc w:val="left"/>
-              <w:rPr>
-                <w:rFonts w:ascii="微软雅黑" w:hAnsi="微软雅黑" w:eastAsia="微软雅黑" w:cs="微软雅黑"/>
-                <w:b/>
-                <w:bCs/>
-                <w:i w:val="0"/>
-                <w:iCs w:val="0"/>
-                <w:caps w:val="0"/>
-                <w:smallCaps w:val="0"/>
-                <w:color w:val="262626" w:themeColor="text1" w:themeTint="D9"/>
-                <w:sz w:val="21"/>
-                <w:szCs w:val="21"/>
-                <w14:textFill>
-                  <w14:solidFill>
-                    <w14:schemeClr w14:val="tx1">
-                      <w14:lumMod w14:val="85000"/>
-                      <w14:lumOff w14:val="15000"/>
-                    </w14:schemeClr>
-                  </w14:solidFill>
-                </w14:textFill>
-              </w:rPr>
-            </w:pPr>
-            <w:r>
-              <w:rPr>
-                <w:rFonts w:ascii="微软雅黑" w:hAnsi="微软雅黑" w:eastAsia="微软雅黑" w:cs="微软雅黑"/>
-                <w:b/>
-                <w:bCs/>
-                <w:i w:val="0"/>
-                <w:iCs w:val="0"/>
-                <w:caps w:val="0"/>
-                <w:smallCaps w:val="0"/>
-                <w:color w:val="262626" w:themeColor="text1" w:themeTint="D9"/>
-                <w:sz w:val="21"/>
-                <w:szCs w:val="21"/>
-                <w14:textFill>
-                  <w14:solidFill>
-                    <w14:schemeClr w14:val="tx1">
-                      <w14:lumMod w14:val="85000"/>
-                      <w14:lumOff w14:val="15000"/>
-                    </w14:schemeClr>
-                  </w14:solidFill>
-                </w14:textFill>
-              </w:rPr>
-              <w:t>Professional</w:t>
+              <w:t>Master Mini Ultra</w:t>
             </w:r>
           </w:p>
         </w:tc>
@@ -7491,7 +7437,7 @@
           <wp:inline distT="0" distB="0" distL="114300" distR="114300">
             <wp:extent cx="4238625" cy="4221480"/>
             <wp:effectExtent l="0" t="0" r="3175" b="20320"/>
-            <wp:docPr id="1861875193" name="drawing" descr="/Users/xinzhang/Library/Containers/com.kingsoft.wpsoffice.mac/Data/tmp/picturecompress_20260923104501/output_1.jpgoutput_1" title="img_v3_02ri_17c5b404-bf9c-4aeb-9257-086bec69c41g.jpg"/>
+            <wp:docPr id="1861875193" name="drawing" descr="/Users/xinzhang/Library/Containers/com.kingsoft.wpsoffice.mac/Data/tmp/picturecompress_20260925230408/output_1.jpgoutput_1" title="img_v3_02ri_17c5b404-bf9c-4aeb-9257-086bec69c41g.jpg"/>
             <wp:cNvGraphicFramePr>
               <a:graphicFrameLocks xmlns:a="http://schemas.openxmlformats.org/drawingml/2006/main" noChangeAspect="1"/>
             </wp:cNvGraphicFramePr>
@@ -7499,7 +7445,7 @@
               <a:graphicData uri="http://schemas.openxmlformats.org/drawingml/2006/picture">
                 <pic:pic xmlns:pic="http://schemas.openxmlformats.org/drawingml/2006/picture">
                   <pic:nvPicPr>
-                    <pic:cNvPr id="1861875193" name="drawing" descr="/Users/xinzhang/Library/Containers/com.kingsoft.wpsoffice.mac/Data/tmp/picturecompress_20260923104501/output_1.jpgoutput_1" title="img_v3_02ri_17c5b404-bf9c-4aeb-9257-086bec69c41g.jpg"/>
+                    <pic:cNvPr id="1861875193" name="drawing" descr="/Users/xinzhang/Library/Containers/com.kingsoft.wpsoffice.mac/Data/tmp/picturecompress_20260925230408/output_1.jpgoutput_1" title="img_v3_02ri_17c5b404-bf9c-4aeb-9257-086bec69c41g.jpg"/>
                     <pic:cNvPicPr>
                       <a:picLocks noChangeAspect="1"/>
                     </pic:cNvPicPr>
@@ -7541,6 +7487,8 @@
         </w:rPr>
         <w:t>2.2.1.2 Coordinate Systems</w:t>
       </w:r>
+      <w:bookmarkStart w:id="0" w:name="_GoBack"/>
+      <w:bookmarkEnd w:id="0"/>
     </w:p>
     <w:p>
       <w:pPr>
@@ -7592,13 +7540,12 @@
           <w:szCs w:val="24"/>
         </w:rPr>
       </w:pPr>
-      <w:bookmarkStart w:id="0" w:name="_GoBack"/>
       <w:r>
         <w:drawing>
           <wp:inline distT="0" distB="0" distL="114300" distR="114300">
             <wp:extent cx="2552065" cy="2263140"/>
             <wp:effectExtent l="0" t="0" r="13335" b="22860"/>
-            <wp:docPr id="527791058" name="drawing" descr="/Users/xinzhang/Library/Containers/com.kingsoft.wpsoffice.mac/Data/tmp/picturecompress_20260923104501/output_2.pngoutput_2" title="image.png"/>
+            <wp:docPr id="527791058" name="drawing" descr="/Users/xinzhang/Library/Containers/com.kingsoft.wpsoffice.mac/Data/tmp/picturecompress_20260925230408/output_2.pngoutput_2" title="image.png"/>
             <wp:cNvGraphicFramePr>
               <a:graphicFrameLocks xmlns:a="http://schemas.openxmlformats.org/drawingml/2006/main" noChangeAspect="1"/>
             </wp:cNvGraphicFramePr>
@@ -7606,7 +7553,7 @@
               <a:graphicData uri="http://schemas.openxmlformats.org/drawingml/2006/picture">
                 <pic:pic xmlns:pic="http://schemas.openxmlformats.org/drawingml/2006/picture">
                   <pic:nvPicPr>
-                    <pic:cNvPr id="527791058" name="drawing" descr="/Users/xinzhang/Library/Containers/com.kingsoft.wpsoffice.mac/Data/tmp/picturecompress_20260923104501/output_2.pngoutput_2" title="image.png"/>
+                    <pic:cNvPr id="527791058" name="drawing" descr="/Users/xinzhang/Library/Containers/com.kingsoft.wpsoffice.mac/Data/tmp/picturecompress_20260925230408/output_2.pngoutput_2" title="image.png"/>
                     <pic:cNvPicPr>
                       <a:picLocks noChangeAspect="1"/>
                     </pic:cNvPicPr>
@@ -7637,7 +7584,7 @@
           <wp:inline distT="0" distB="0" distL="114300" distR="114300">
             <wp:extent cx="2150745" cy="2407285"/>
             <wp:effectExtent l="0" t="0" r="8255" b="5715"/>
-            <wp:docPr id="1120671740" name="drawing" descr="/Users/xinzhang/Library/Containers/com.kingsoft.wpsoffice.mac/Data/tmp/picturecompress_20260923104501/output_3.pngoutput_3" title="image.png"/>
+            <wp:docPr id="1120671740" name="drawing" descr="/Users/xinzhang/Library/Containers/com.kingsoft.wpsoffice.mac/Data/tmp/picturecompress_20260925230408/output_3.pngoutput_3" title="image.png"/>
             <wp:cNvGraphicFramePr>
               <a:graphicFrameLocks xmlns:a="http://schemas.openxmlformats.org/drawingml/2006/main" noChangeAspect="1"/>
             </wp:cNvGraphicFramePr>
@@ -7645,7 +7592,7 @@
               <a:graphicData uri="http://schemas.openxmlformats.org/drawingml/2006/picture">
                 <pic:pic xmlns:pic="http://schemas.openxmlformats.org/drawingml/2006/picture">
                   <pic:nvPicPr>
-                    <pic:cNvPr id="1120671740" name="drawing" descr="/Users/xinzhang/Library/Containers/com.kingsoft.wpsoffice.mac/Data/tmp/picturecompress_20260923104501/output_3.pngoutput_3" title="image.png"/>
+                    <pic:cNvPr id="1120671740" name="drawing" descr="/Users/xinzhang/Library/Containers/com.kingsoft.wpsoffice.mac/Data/tmp/picturecompress_20260925230408/output_3.pngoutput_3" title="image.png"/>
                     <pic:cNvPicPr>
                       <a:picLocks noChangeAspect="1"/>
                     </pic:cNvPicPr>
@@ -7672,7 +7619,6 @@
         </w:drawing>
       </w:r>
     </w:p>
-    <w:bookmarkEnd w:id="0"/>
     <w:p>
       <w:pPr>
         <w:pStyle w:val="5"/>
@@ -7776,7 +7722,7 @@
                 <w:sz w:val="21"/>
                 <w:szCs w:val="21"/>
               </w:rPr>
-              <w:t>·Geek</w:t>
+              <w:t>Master Mini</w:t>
             </w:r>
           </w:p>
         </w:tc>
@@ -7803,7 +7749,7 @@
                 <w:sz w:val="21"/>
                 <w:szCs w:val="21"/>
               </w:rPr>
-              <w:t>Education</w:t>
+              <w:t>Master Mini Pro</w:t>
             </w:r>
           </w:p>
         </w:tc>
@@ -7813,8 +7759,10 @@
           </w:tcPr>
           <w:p>
             <w:pPr>
-              <w:bidi w:val="0"/>
-              <w:spacing w:before="0" w:beforeAutospacing="0" w:after="0" w:afterAutospacing="0" w:line="300" w:lineRule="auto"/>
+              <w:suppressLineNumbers w:val="0"/>
+              <w:bidi w:val="0"/>
+              <w:spacing w:before="0" w:beforeAutospacing="0" w:after="0" w:afterAutospacing="0" w:line="300" w:lineRule="auto"/>
+              <w:ind w:left="0" w:right="0"/>
               <w:jc w:val="center"/>
             </w:pPr>
             <w:r>
@@ -7830,7 +7778,7 @@
                 <w:sz w:val="21"/>
                 <w:szCs w:val="21"/>
               </w:rPr>
-              <w:t>Professional</w:t>
+              <w:t>Master Mini Ultra</w:t>
             </w:r>
           </w:p>
         </w:tc>
@@ -9896,7 +9844,7 @@
           <wp:inline distT="0" distB="0" distL="114300" distR="114300">
             <wp:extent cx="6673850" cy="4599305"/>
             <wp:effectExtent l="0" t="0" r="6350" b="23495"/>
-            <wp:docPr id="163853520" name="drawing" descr="/Users/xinzhang/Library/Containers/com.kingsoft.wpsoffice.mac/Data/tmp/picturecompress_20260923104501/output_4.pngoutput_4" title="Feishu whiteboard"/>
+            <wp:docPr id="163853520" name="drawing" descr="/Users/xinzhang/Library/Containers/com.kingsoft.wpsoffice.mac/Data/tmp/picturecompress_20260925230408/output_4.pngoutput_4" title="Feishu whiteboard"/>
             <wp:cNvGraphicFramePr>
               <a:graphicFrameLocks xmlns:a="http://schemas.openxmlformats.org/drawingml/2006/main" noChangeAspect="1"/>
             </wp:cNvGraphicFramePr>
@@ -9904,7 +9852,7 @@
               <a:graphicData uri="http://schemas.openxmlformats.org/drawingml/2006/picture">
                 <pic:pic xmlns:pic="http://schemas.openxmlformats.org/drawingml/2006/picture">
                   <pic:nvPicPr>
-                    <pic:cNvPr id="163853520" name="drawing" descr="/Users/xinzhang/Library/Containers/com.kingsoft.wpsoffice.mac/Data/tmp/picturecompress_20260923104501/output_4.pngoutput_4" title="Feishu whiteboard"/>
+                    <pic:cNvPr id="163853520" name="drawing" descr="/Users/xinzhang/Library/Containers/com.kingsoft.wpsoffice.mac/Data/tmp/picturecompress_20260925230408/output_4.pngoutput_4" title="Feishu whiteboard"/>
                     <pic:cNvPicPr>
                       <a:picLocks noChangeAspect="1"/>
                     </pic:cNvPicPr>
@@ -11596,7 +11544,7 @@
           <wp:inline distT="0" distB="0" distL="114300" distR="114300">
             <wp:extent cx="6144895" cy="4603750"/>
             <wp:effectExtent l="0" t="0" r="1905" b="19050"/>
-            <wp:docPr id="1080023924" name="drawing" descr="/Users/xinzhang/Library/Containers/com.kingsoft.wpsoffice.mac/Data/tmp/picturecompress_20260923104501/output_5.jpgoutput_5" title="20250527-171852.jpg"/>
+            <wp:docPr id="1080023924" name="drawing" descr="/Users/xinzhang/Library/Containers/com.kingsoft.wpsoffice.mac/Data/tmp/picturecompress_20260925230408/output_5.jpgoutput_5" title="20250527-171852.jpg"/>
             <wp:cNvGraphicFramePr>
               <a:graphicFrameLocks xmlns:a="http://schemas.openxmlformats.org/drawingml/2006/main" noChangeAspect="1"/>
             </wp:cNvGraphicFramePr>
@@ -11604,7 +11552,7 @@
               <a:graphicData uri="http://schemas.openxmlformats.org/drawingml/2006/picture">
                 <pic:pic xmlns:pic="http://schemas.openxmlformats.org/drawingml/2006/picture">
                   <pic:nvPicPr>
-                    <pic:cNvPr id="1080023924" name="drawing" descr="/Users/xinzhang/Library/Containers/com.kingsoft.wpsoffice.mac/Data/tmp/picturecompress_20260923104501/output_5.jpgoutput_5" title="20250527-171852.jpg"/>
+                    <pic:cNvPr id="1080023924" name="drawing" descr="/Users/xinzhang/Library/Containers/com.kingsoft.wpsoffice.mac/Data/tmp/picturecompress_20260925230408/output_5.jpgoutput_5" title="20250527-171852.jpg"/>
                     <pic:cNvPicPr>
                       <a:picLocks noChangeAspect="1"/>
                     </pic:cNvPicPr>
@@ -25569,24 +25517,8 @@
     </w:p>
     <w:p>
       <w:pPr>
-        <w:pStyle w:val="4"/>
-      </w:pPr>
-      <w:r>
-        <w:rPr>
-          <w:lang w:val="en-US"/>
-        </w:rPr>
-        <w:t>7.1 Connect via App</w:t>
-      </w:r>
-    </w:p>
-    <w:p>
-      <w:pPr>
-        <w:pStyle w:val="11"/>
-        <w:numPr>
-          <w:ilvl w:val="0"/>
-          <w:numId w:val="17"/>
-        </w:numPr>
         <w:shd w:val="clear" w:color="auto" w:fill="FFFFFF" w:themeFill="background1"/>
-        <w:spacing w:before="240" w:beforeAutospacing="0" w:after="180" w:afterAutospacing="0" w:line="360" w:lineRule="auto"/>
+        <w:spacing w:before="0" w:beforeAutospacing="0" w:after="0" w:afterAutospacing="0" w:line="360" w:lineRule="auto"/>
         <w:rPr>
           <w:rFonts w:ascii="微软雅黑" w:hAnsi="微软雅黑" w:eastAsia="微软雅黑" w:cs="微软雅黑"/>
           <w:b w:val="0"/>
@@ -25595,68 +25527,51 @@
           <w:iCs w:val="0"/>
           <w:caps w:val="0"/>
           <w:smallCaps w:val="0"/>
-          <w:strike w:val="0"/>
-          <w:dstrike w:val="0"/>
-          <w:color w:val="0071E3"/>
+          <w:color w:val="9C9C9C"/>
           <w:sz w:val="21"/>
           <w:szCs w:val="21"/>
-          <w:u w:val="none"/>
-          <w:lang w:val="en-US"/>
-        </w:rPr>
-      </w:pPr>
-      <w:r>
-        <w:fldChar w:fldCharType="begin"/>
-      </w:r>
-      <w:r>
-        <w:instrText xml:space="preserve"> HYPERLINK "https://www.booster.tech/app-download/" \h </w:instrText>
-      </w:r>
-      <w:r>
-        <w:fldChar w:fldCharType="separate"/>
-      </w:r>
-      <w:r>
-        <w:rPr>
-          <w:rStyle w:val="10"/>
-          <w:b w:val="0"/>
-          <w:bCs w:val="0"/>
-          <w:i w:val="0"/>
-          <w:iCs w:val="0"/>
-          <w:caps w:val="0"/>
-          <w:smallCaps w:val="0"/>
-          <w:strike w:val="0"/>
-          <w:dstrike w:val="0"/>
-          <w:color w:val="0071E3"/>
-          <w:u w:val="none"/>
-          <w:lang w:val="en-US"/>
-        </w:rPr>
-        <w:t>Download and install App</w:t>
-      </w:r>
-      <w:r>
-        <w:rPr>
-          <w:rStyle w:val="10"/>
-          <w:b w:val="0"/>
-          <w:bCs w:val="0"/>
-          <w:i w:val="0"/>
-          <w:iCs w:val="0"/>
-          <w:caps w:val="0"/>
-          <w:smallCaps w:val="0"/>
-          <w:strike w:val="0"/>
-          <w:dstrike w:val="0"/>
-          <w:color w:val="0071E3"/>
-          <w:u w:val="none"/>
-          <w:lang w:val="en-US"/>
-        </w:rPr>
-        <w:fldChar w:fldCharType="end"/>
-      </w:r>
+          <w:lang w:val="en-US"/>
+        </w:rPr>
+      </w:pPr>
     </w:p>
     <w:p>
       <w:pPr>
-        <w:pStyle w:val="11"/>
+        <w:shd w:val="clear" w:color="auto" w:fill="FFFFFF" w:themeFill="background1"/>
+        <w:spacing w:before="240" w:beforeAutospacing="0" w:after="180" w:afterAutospacing="0" w:line="360" w:lineRule="auto"/>
+      </w:pPr>
+    </w:p>
+    <w:p>
+      <w:pPr>
+        <w:pStyle w:val="3"/>
         <w:numPr>
           <w:ilvl w:val="0"/>
           <w:numId w:val="17"/>
         </w:numPr>
+      </w:pPr>
+      <w:r>
+        <w:rPr>
+          <w:lang w:val="en-US"/>
+        </w:rPr>
+        <w:t>Use Agents</w:t>
+      </w:r>
+    </w:p>
+    <w:p>
+      <w:pPr>
+        <w:pStyle w:val="4"/>
+      </w:pPr>
+      <w:r>
+        <w:rPr>
+          <w:lang w:val="en-US"/>
+        </w:rPr>
+        <w:t>8.1 What Is an Agent?</w:t>
+      </w:r>
+    </w:p>
+    <w:p>
+      <w:pPr>
         <w:shd w:val="clear" w:color="auto" w:fill="FFFFFF" w:themeFill="background1"/>
-        <w:spacing w:before="240" w:beforeAutospacing="0" w:after="180" w:afterAutospacing="0" w:line="360" w:lineRule="auto"/>
+        <w:spacing w:before="0" w:beforeAutospacing="0" w:after="180" w:afterAutospacing="0" w:line="360" w:lineRule="auto"/>
+      </w:pPr>
+      <w:r>
         <w:rPr>
           <w:rFonts w:ascii="微软雅黑" w:hAnsi="微软雅黑" w:eastAsia="微软雅黑" w:cs="微软雅黑"/>
           <w:b w:val="0"/>
@@ -25670,8 +25585,69 @@
           <w:szCs w:val="21"/>
           <w:lang w:val="en-US"/>
         </w:rPr>
+        <w:t>An Agent is a "skill pack" installed in the robot's brain. It can also be understood as an application running on the robot. Like switching apps on a phone, switching Agents lets the robot enter the corresponding capability scenario and use different interaction methods and task capabilities.</w:t>
+      </w:r>
+    </w:p>
+    <w:p>
+      <w:pPr>
+        <w:pStyle w:val="4"/>
       </w:pPr>
       <w:r>
+        <w:rPr>
+          <w:lang w:val="en-US"/>
+        </w:rPr>
+        <w:t>8.2 How to Switch Agents</w:t>
+      </w:r>
+    </w:p>
+    <w:p>
+      <w:pPr>
+        <w:pStyle w:val="11"/>
+        <w:numPr>
+          <w:ilvl w:val="0"/>
+          <w:numId w:val="18"/>
+        </w:numPr>
+        <w:shd w:val="clear" w:color="auto" w:fill="FFFFFF" w:themeFill="background1"/>
+        <w:spacing w:before="240" w:beforeAutospacing="0" w:after="180" w:afterAutospacing="0" w:line="360" w:lineRule="auto"/>
+        <w:rPr>
+          <w:rFonts w:ascii="微软雅黑" w:hAnsi="微软雅黑" w:eastAsia="微软雅黑" w:cs="微软雅黑"/>
+          <w:b/>
+          <w:bCs/>
+          <w:i w:val="0"/>
+          <w:iCs w:val="0"/>
+          <w:caps w:val="0"/>
+          <w:smallCaps w:val="0"/>
+          <w:color w:val="172033"/>
+          <w:sz w:val="21"/>
+          <w:szCs w:val="21"/>
+          <w:lang w:val="en-US"/>
+        </w:rPr>
+      </w:pPr>
+      <w:r>
+        <w:rPr>
+          <w:rFonts w:ascii="微软雅黑" w:hAnsi="微软雅黑" w:eastAsia="微软雅黑" w:cs="微软雅黑"/>
+          <w:b/>
+          <w:bCs/>
+          <w:i w:val="0"/>
+          <w:iCs w:val="0"/>
+          <w:caps w:val="0"/>
+          <w:smallCaps w:val="0"/>
+          <w:color w:val="172033"/>
+          <w:sz w:val="21"/>
+          <w:szCs w:val="21"/>
+          <w:lang w:val="en-US"/>
+        </w:rPr>
+        <w:t>Switch via the mobile App</w:t>
+      </w:r>
+    </w:p>
+    <w:p>
+      <w:pPr>
+        <w:pStyle w:val="11"/>
+        <w:numPr>
+          <w:ilvl w:val="1"/>
+          <w:numId w:val="18"/>
+        </w:numPr>
+        <w:shd w:val="clear" w:color="auto" w:fill="FFFFFF" w:themeFill="background1"/>
+        <w:spacing w:before="0" w:beforeAutospacing="0" w:after="180" w:afterAutospacing="0" w:line="360" w:lineRule="auto"/>
         <w:rPr>
           <w:rFonts w:ascii="微软雅黑" w:hAnsi="微软雅黑" w:eastAsia="微软雅黑" w:cs="微软雅黑"/>
           <w:b w:val="0"/>
@@ -25685,18 +25661,8 @@
           <w:szCs w:val="21"/>
           <w:lang w:val="en-US"/>
         </w:rPr>
-        <w:t>After signing up and signing in, tap "Connect Robot" on the home page.</w:t>
-      </w:r>
-    </w:p>
-    <w:p>
-      <w:pPr>
-        <w:pStyle w:val="11"/>
-        <w:numPr>
-          <w:ilvl w:val="0"/>
-          <w:numId w:val="17"/>
-        </w:numPr>
-        <w:shd w:val="clear" w:color="auto" w:fill="FFFFFF" w:themeFill="background1"/>
-        <w:spacing w:before="240" w:beforeAutospacing="0" w:after="180" w:afterAutospacing="0" w:line="360" w:lineRule="auto"/>
+      </w:pPr>
+      <w:r>
         <w:rPr>
           <w:rFonts w:ascii="微软雅黑" w:hAnsi="微软雅黑" w:eastAsia="微软雅黑" w:cs="微软雅黑"/>
           <w:b w:val="0"/>
@@ -25710,338 +25676,7 @@
           <w:szCs w:val="21"/>
           <w:lang w:val="en-US"/>
         </w:rPr>
-      </w:pPr>
-      <w:r>
-        <w:rPr>
-          <w:rFonts w:ascii="微软雅黑" w:hAnsi="微软雅黑" w:eastAsia="微软雅黑" w:cs="微软雅黑"/>
-          <w:b w:val="0"/>
-          <w:bCs w:val="0"/>
-          <w:i w:val="0"/>
-          <w:iCs w:val="0"/>
-          <w:caps w:val="0"/>
-          <w:smallCaps w:val="0"/>
-          <w:color w:val="172033"/>
-          <w:sz w:val="21"/>
-          <w:szCs w:val="21"/>
-          <w:lang w:val="en-US"/>
-        </w:rPr>
-        <w:t>A list of robots on the same network as your phone appears below. If the robot you want to connect is not listed, tap "Discover Devices".</w:t>
-      </w:r>
-    </w:p>
-    <w:p>
-      <w:pPr>
-        <w:pStyle w:val="11"/>
-        <w:numPr>
-          <w:ilvl w:val="0"/>
-          <w:numId w:val="17"/>
-        </w:numPr>
-        <w:shd w:val="clear" w:color="auto" w:fill="FFFFFF" w:themeFill="background1"/>
-        <w:spacing w:before="240" w:beforeAutospacing="0" w:after="180" w:afterAutospacing="0" w:line="360" w:lineRule="auto"/>
-        <w:rPr>
-          <w:rFonts w:ascii="微软雅黑" w:hAnsi="微软雅黑" w:eastAsia="微软雅黑" w:cs="微软雅黑"/>
-          <w:b w:val="0"/>
-          <w:bCs w:val="0"/>
-          <w:i w:val="0"/>
-          <w:iCs w:val="0"/>
-          <w:caps w:val="0"/>
-          <w:smallCaps w:val="0"/>
-          <w:color w:val="172033"/>
-          <w:sz w:val="21"/>
-          <w:szCs w:val="21"/>
-          <w:lang w:val="en-US"/>
-        </w:rPr>
-      </w:pPr>
-      <w:r>
-        <w:rPr>
-          <w:rFonts w:ascii="微软雅黑" w:hAnsi="微软雅黑" w:eastAsia="微软雅黑" w:cs="微软雅黑"/>
-          <w:b w:val="0"/>
-          <w:bCs w:val="0"/>
-          <w:i w:val="0"/>
-          <w:iCs w:val="0"/>
-          <w:caps w:val="0"/>
-          <w:smallCaps w:val="0"/>
-          <w:color w:val="172033"/>
-          <w:sz w:val="21"/>
-          <w:szCs w:val="21"/>
-          <w:lang w:val="en-US"/>
-        </w:rPr>
-        <w:t>In the "Discover Nearby Robots" list, select your robot.</w:t>
-      </w:r>
-    </w:p>
-    <w:p>
-      <w:pPr>
-        <w:shd w:val="clear" w:color="auto" w:fill="FFFFFF" w:themeFill="background1"/>
-        <w:spacing w:before="0" w:beforeAutospacing="0" w:after="0" w:afterAutospacing="0" w:line="360" w:lineRule="auto"/>
-      </w:pPr>
-      <w:r>
-        <w:rPr>
-          <w:rFonts w:ascii="微软雅黑" w:hAnsi="微软雅黑" w:eastAsia="微软雅黑" w:cs="微软雅黑"/>
-          <w:b w:val="0"/>
-          <w:bCs w:val="0"/>
-          <w:i w:val="0"/>
-          <w:iCs w:val="0"/>
-          <w:caps w:val="0"/>
-          <w:smallCaps w:val="0"/>
-          <w:color w:val="9C9C9C"/>
-          <w:sz w:val="21"/>
-          <w:szCs w:val="21"/>
-          <w:lang w:val="en-US"/>
-        </w:rPr>
-        <w:t>Bluetooth and Location must be enabled, and the app must be granted the required permissions.</w:t>
-      </w:r>
-    </w:p>
-    <w:p>
-      <w:pPr>
-        <w:pStyle w:val="11"/>
-        <w:numPr>
-          <w:ilvl w:val="0"/>
-          <w:numId w:val="17"/>
-        </w:numPr>
-        <w:shd w:val="clear" w:color="auto" w:fill="FFFFFF" w:themeFill="background1"/>
-        <w:spacing w:before="240" w:beforeAutospacing="0" w:after="180" w:afterAutospacing="0" w:line="360" w:lineRule="auto"/>
-        <w:rPr>
-          <w:rFonts w:ascii="微软雅黑" w:hAnsi="微软雅黑" w:eastAsia="微软雅黑" w:cs="微软雅黑"/>
-          <w:b w:val="0"/>
-          <w:bCs w:val="0"/>
-          <w:i w:val="0"/>
-          <w:iCs w:val="0"/>
-          <w:caps w:val="0"/>
-          <w:smallCaps w:val="0"/>
-          <w:color w:val="172033"/>
-          <w:sz w:val="21"/>
-          <w:szCs w:val="21"/>
-          <w:lang w:val="en-US"/>
-        </w:rPr>
-      </w:pPr>
-      <w:r>
-        <w:rPr>
-          <w:rFonts w:ascii="微软雅黑" w:hAnsi="微软雅黑" w:eastAsia="微软雅黑" w:cs="微软雅黑"/>
-          <w:b w:val="0"/>
-          <w:bCs w:val="0"/>
-          <w:i w:val="0"/>
-          <w:iCs w:val="0"/>
-          <w:caps w:val="0"/>
-          <w:smallCaps w:val="0"/>
-          <w:color w:val="172033"/>
-          <w:sz w:val="21"/>
-          <w:szCs w:val="21"/>
-          <w:lang w:val="en-US"/>
-        </w:rPr>
-        <w:t>Two connection modes are available:</w:t>
-      </w:r>
-    </w:p>
-    <w:p>
-      <w:pPr>
-        <w:pStyle w:val="11"/>
-        <w:numPr>
-          <w:ilvl w:val="1"/>
-          <w:numId w:val="17"/>
-        </w:numPr>
-        <w:shd w:val="clear" w:color="auto" w:fill="FFFFFF" w:themeFill="background1"/>
-        <w:spacing w:before="0" w:beforeAutospacing="0" w:after="180" w:afterAutospacing="0" w:line="360" w:lineRule="auto"/>
-        <w:rPr>
-          <w:rFonts w:ascii="微软雅黑" w:hAnsi="微软雅黑" w:eastAsia="微软雅黑" w:cs="微软雅黑"/>
-          <w:b w:val="0"/>
-          <w:bCs w:val="0"/>
-          <w:i w:val="0"/>
-          <w:iCs w:val="0"/>
-          <w:caps w:val="0"/>
-          <w:smallCaps w:val="0"/>
-          <w:color w:val="172033"/>
-          <w:sz w:val="21"/>
-          <w:szCs w:val="21"/>
-          <w:lang w:val="en-US"/>
-        </w:rPr>
-      </w:pPr>
-      <w:r>
-        <w:rPr>
-          <w:rFonts w:ascii="微软雅黑" w:hAnsi="微软雅黑" w:eastAsia="微软雅黑" w:cs="微软雅黑"/>
-          <w:b w:val="0"/>
-          <w:bCs w:val="0"/>
-          <w:i w:val="0"/>
-          <w:iCs w:val="0"/>
-          <w:caps w:val="0"/>
-          <w:smallCaps w:val="0"/>
-          <w:color w:val="172033"/>
-          <w:sz w:val="21"/>
-          <w:szCs w:val="21"/>
-          <w:lang w:val="en-US"/>
-        </w:rPr>
-        <w:t>Wi-Fi connection mode: connect the robot to the same Wi-Fi network as your phone, or connect the robot to your phone hotspot. This mode is suitable when network conditions are good.</w:t>
-      </w:r>
-    </w:p>
-    <w:p>
-      <w:pPr>
-        <w:pStyle w:val="11"/>
-        <w:numPr>
-          <w:ilvl w:val="1"/>
-          <w:numId w:val="17"/>
-        </w:numPr>
-        <w:shd w:val="clear" w:color="auto" w:fill="FFFFFF" w:themeFill="background1"/>
-        <w:spacing w:before="60" w:beforeAutospacing="0" w:after="180" w:afterAutospacing="0" w:line="360" w:lineRule="auto"/>
-        <w:rPr>
-          <w:rFonts w:ascii="微软雅黑" w:hAnsi="微软雅黑" w:eastAsia="微软雅黑" w:cs="微软雅黑"/>
-          <w:b w:val="0"/>
-          <w:bCs w:val="0"/>
-          <w:i w:val="0"/>
-          <w:iCs w:val="0"/>
-          <w:caps w:val="0"/>
-          <w:smallCaps w:val="0"/>
-          <w:color w:val="172033"/>
-          <w:sz w:val="21"/>
-          <w:szCs w:val="21"/>
-          <w:lang w:val="en-US"/>
-        </w:rPr>
-      </w:pPr>
-      <w:r>
-        <w:rPr>
-          <w:rFonts w:ascii="微软雅黑" w:hAnsi="微软雅黑" w:eastAsia="微软雅黑" w:cs="微软雅黑"/>
-          <w:b w:val="0"/>
-          <w:bCs w:val="0"/>
-          <w:i w:val="0"/>
-          <w:iCs w:val="0"/>
-          <w:caps w:val="0"/>
-          <w:smallCaps w:val="0"/>
-          <w:color w:val="172033"/>
-          <w:sz w:val="21"/>
-          <w:szCs w:val="21"/>
-          <w:lang w:val="en-US"/>
-        </w:rPr>
-        <w:t>Direct connection mode: connect your phone to the robot hotspot. This mode is suitable when no network is available and your phone is close to the robot.</w:t>
-      </w:r>
-    </w:p>
-    <w:p>
-      <w:pPr>
-        <w:shd w:val="clear" w:color="auto" w:fill="FFFFFF" w:themeFill="background1"/>
-        <w:spacing w:before="240" w:beforeAutospacing="0" w:after="180" w:afterAutospacing="0" w:line="360" w:lineRule="auto"/>
-      </w:pPr>
-      <w:r>
-        <w:drawing>
-          <wp:inline distT="0" distB="0" distL="114300" distR="114300">
-            <wp:extent cx="5756275" cy="2590165"/>
-            <wp:effectExtent l="0" t="0" r="9525" b="635"/>
-            <wp:docPr id="546713124" name="drawing" descr="/Users/xinzhang/Library/Containers/com.kingsoft.wpsoffice.mac/Data/tmp/picturecompress_20260923104501/output_6.jpgoutput_6" title="20260707-190925.881-9.jpg"/>
-            <wp:cNvGraphicFramePr>
-              <a:graphicFrameLocks xmlns:a="http://schemas.openxmlformats.org/drawingml/2006/main" noChangeAspect="1"/>
-            </wp:cNvGraphicFramePr>
-            <a:graphic xmlns:a="http://schemas.openxmlformats.org/drawingml/2006/main">
-              <a:graphicData uri="http://schemas.openxmlformats.org/drawingml/2006/picture">
-                <pic:pic xmlns:pic="http://schemas.openxmlformats.org/drawingml/2006/picture">
-                  <pic:nvPicPr>
-                    <pic:cNvPr id="546713124" name="drawing" descr="/Users/xinzhang/Library/Containers/com.kingsoft.wpsoffice.mac/Data/tmp/picturecompress_20260923104501/output_6.jpgoutput_6" title="20260707-190925.881-9.jpg"/>
-                    <pic:cNvPicPr>
-                      <a:picLocks noChangeAspect="1"/>
-                    </pic:cNvPicPr>
-                  </pic:nvPicPr>
-                  <pic:blipFill>
-                    <a:blip r:embed="rId11"/>
-                    <a:stretch>
-                      <a:fillRect/>
-                    </a:stretch>
-                  </pic:blipFill>
-                  <pic:spPr>
-                    <a:xfrm>
-                      <a:off x="0" y="0"/>
-                      <a:ext cx="5756275" cy="2590392"/>
-                    </a:xfrm>
-                    <a:prstGeom prst="rect">
-                      <a:avLst/>
-                    </a:prstGeom>
-                  </pic:spPr>
-                </pic:pic>
-              </a:graphicData>
-            </a:graphic>
-          </wp:inline>
-        </w:drawing>
-      </w:r>
-    </w:p>
-    <w:p>
-      <w:pPr>
-        <w:pStyle w:val="11"/>
-        <w:numPr>
-          <w:ilvl w:val="0"/>
-          <w:numId w:val="17"/>
-        </w:numPr>
-        <w:shd w:val="clear" w:color="auto" w:fill="FFFFFF" w:themeFill="background1"/>
-        <w:spacing w:before="240" w:beforeAutospacing="0" w:after="180" w:afterAutospacing="0" w:line="360" w:lineRule="auto"/>
-      </w:pPr>
-      <w:r>
-        <w:rPr>
-          <w:rFonts w:ascii="微软雅黑" w:hAnsi="微软雅黑" w:eastAsia="微软雅黑" w:cs="微软雅黑"/>
-          <w:b w:val="0"/>
-          <w:bCs w:val="0"/>
-          <w:i w:val="0"/>
-          <w:iCs w:val="0"/>
-          <w:caps w:val="0"/>
-          <w:smallCaps w:val="0"/>
-          <w:color w:val="172033"/>
-          <w:sz w:val="21"/>
-          <w:szCs w:val="21"/>
-          <w:lang w:val="en-US"/>
-        </w:rPr>
-        <w:t>If you choose Wi-Fi connection mode, select the same network as your phone, or your phone hotspot, from the Wi-Fi list. Enter the password and confirm the connection. If the connection succeeds, the robot control page opens automatically.</w:t>
-      </w:r>
-    </w:p>
-    <w:p>
-      <w:pPr>
-        <w:pStyle w:val="11"/>
-        <w:numPr>
-          <w:ilvl w:val="0"/>
-          <w:numId w:val="17"/>
-        </w:numPr>
-        <w:shd w:val="clear" w:color="auto" w:fill="FFFFFF" w:themeFill="background1"/>
-        <w:spacing w:before="240" w:beforeAutospacing="0" w:after="180" w:afterAutospacing="0" w:line="360" w:lineRule="auto"/>
-        <w:rPr>
-          <w:rFonts w:ascii="微软雅黑" w:hAnsi="微软雅黑" w:eastAsia="微软雅黑" w:cs="微软雅黑"/>
-          <w:b w:val="0"/>
-          <w:bCs w:val="0"/>
-          <w:i w:val="0"/>
-          <w:iCs w:val="0"/>
-          <w:caps w:val="0"/>
-          <w:smallCaps w:val="0"/>
-          <w:color w:val="172033"/>
-          <w:sz w:val="21"/>
-          <w:szCs w:val="21"/>
-          <w:lang w:val="en-US"/>
-        </w:rPr>
-      </w:pPr>
-      <w:r>
-        <w:rPr>
-          <w:rFonts w:ascii="微软雅黑" w:hAnsi="微软雅黑" w:eastAsia="微软雅黑" w:cs="微软雅黑"/>
-          <w:b w:val="0"/>
-          <w:bCs w:val="0"/>
-          <w:i w:val="0"/>
-          <w:iCs w:val="0"/>
-          <w:caps w:val="0"/>
-          <w:smallCaps w:val="0"/>
-          <w:color w:val="172033"/>
-          <w:sz w:val="21"/>
-          <w:szCs w:val="21"/>
-          <w:lang w:val="en-US"/>
-        </w:rPr>
-        <w:t>If you choose direct connection mode, the robot control page opens automatically after loading.</w:t>
-      </w:r>
-    </w:p>
-    <w:p>
-      <w:pPr>
-        <w:pStyle w:val="4"/>
-      </w:pPr>
-      <w:r>
-        <w:rPr>
-          <w:lang w:val="en-US"/>
-        </w:rPr>
-        <w:t>7.2 Connect via Terminal</w:t>
-      </w:r>
-    </w:p>
-    <w:p>
-      <w:pPr>
-        <w:pStyle w:val="5"/>
-      </w:pPr>
-      <w:r>
-        <w:rPr>
-          <w:lang w:val="en-US"/>
-        </w:rPr>
-        <w:t>7.2.1 Wired Connection</w:t>
+        <w:t>Tap the Agent name in the top-left corner to switch to another Agent. Each Agent has different capabilities — for example, Soccer Master can play soccer with you, Hi Chat can talk with you using different personas, and Dance Master can perform a variety of dances from around the world.</w:t>
       </w:r>
     </w:p>
     <w:p>
@@ -26050,579 +25685,6 @@
         <w:numPr>
           <w:ilvl w:val="0"/>
           <w:numId w:val="18"/>
-        </w:numPr>
-        <w:shd w:val="clear" w:color="auto" w:fill="FFFFFF" w:themeFill="background1"/>
-        <w:spacing w:before="0" w:beforeAutospacing="0" w:after="180" w:afterAutospacing="0" w:line="360" w:lineRule="auto"/>
-        <w:rPr>
-          <w:rFonts w:ascii="微软雅黑" w:hAnsi="微软雅黑" w:eastAsia="微软雅黑" w:cs="微软雅黑"/>
-          <w:b w:val="0"/>
-          <w:bCs w:val="0"/>
-          <w:i w:val="0"/>
-          <w:iCs w:val="0"/>
-          <w:caps w:val="0"/>
-          <w:smallCaps w:val="0"/>
-          <w:color w:val="172033"/>
-          <w:sz w:val="21"/>
-          <w:szCs w:val="21"/>
-          <w:lang w:val="en-US"/>
-        </w:rPr>
-      </w:pPr>
-      <w:r>
-        <w:rPr>
-          <w:rFonts w:ascii="微软雅黑" w:hAnsi="微软雅黑" w:eastAsia="微软雅黑" w:cs="微软雅黑"/>
-          <w:b w:val="0"/>
-          <w:bCs w:val="0"/>
-          <w:i w:val="0"/>
-          <w:iCs w:val="0"/>
-          <w:caps w:val="0"/>
-          <w:smallCaps w:val="0"/>
-          <w:color w:val="172033"/>
-          <w:sz w:val="21"/>
-          <w:szCs w:val="21"/>
-          <w:lang w:val="en-US"/>
-        </w:rPr>
-        <w:t>After connecting to the robot with an Ethernet cable, configure the wired network settings.</w:t>
-      </w:r>
-    </w:p>
-    <w:p>
-      <w:pPr>
-        <w:shd w:val="clear" w:color="auto" w:fill="F6F8FA"/>
-        <w:spacing w:before="0" w:beforeAutospacing="0" w:after="0" w:afterAutospacing="0" w:line="330" w:lineRule="auto"/>
-      </w:pPr>
-      <w:r>
-        <w:rPr>
-          <w:rFonts w:ascii="Consolas" w:hAnsi="Consolas" w:eastAsia="Consolas" w:cs="Consolas"/>
-          <w:b w:val="0"/>
-          <w:bCs w:val="0"/>
-          <w:i w:val="0"/>
-          <w:iCs w:val="0"/>
-          <w:caps w:val="0"/>
-          <w:smallCaps w:val="0"/>
-          <w:color w:val="393A34"/>
-          <w:sz w:val="21"/>
-          <w:szCs w:val="21"/>
-          <w:lang w:val="en-US"/>
-        </w:rPr>
-        <w:t xml:space="preserve">address: </w:t>
-      </w:r>
-      <w:r>
-        <w:rPr>
-          <w:rFonts w:ascii="Consolas" w:hAnsi="Consolas" w:eastAsia="Consolas" w:cs="Consolas"/>
-          <w:b w:val="0"/>
-          <w:bCs w:val="0"/>
-          <w:i w:val="0"/>
-          <w:iCs w:val="0"/>
-          <w:caps w:val="0"/>
-          <w:smallCaps w:val="0"/>
-          <w:color w:val="36ACAA"/>
-          <w:sz w:val="21"/>
-          <w:szCs w:val="21"/>
-          <w:lang w:val="en-US"/>
-        </w:rPr>
-        <w:t>192.168</w:t>
-      </w:r>
-      <w:r>
-        <w:rPr>
-          <w:rFonts w:ascii="Consolas" w:hAnsi="Consolas" w:eastAsia="Consolas" w:cs="Consolas"/>
-          <w:b w:val="0"/>
-          <w:bCs w:val="0"/>
-          <w:i w:val="0"/>
-          <w:iCs w:val="0"/>
-          <w:caps w:val="0"/>
-          <w:smallCaps w:val="0"/>
-          <w:color w:val="393A34"/>
-          <w:sz w:val="21"/>
-          <w:szCs w:val="21"/>
-          <w:lang w:val="en-US"/>
-        </w:rPr>
-        <w:t>.10.10</w:t>
-      </w:r>
-    </w:p>
-    <w:p>
-      <w:pPr>
-        <w:shd w:val="clear" w:color="auto" w:fill="F6F8FA"/>
-        <w:spacing w:before="0" w:beforeAutospacing="0" w:after="0" w:afterAutospacing="0" w:line="330" w:lineRule="auto"/>
-      </w:pPr>
-      <w:r>
-        <w:rPr>
-          <w:rFonts w:ascii="Consolas" w:hAnsi="Consolas" w:eastAsia="Consolas" w:cs="Consolas"/>
-          <w:b w:val="0"/>
-          <w:bCs w:val="0"/>
-          <w:i w:val="0"/>
-          <w:iCs w:val="0"/>
-          <w:caps w:val="0"/>
-          <w:smallCaps w:val="0"/>
-          <w:color w:val="393A34"/>
-          <w:sz w:val="21"/>
-          <w:szCs w:val="21"/>
-          <w:lang w:val="en-US"/>
-        </w:rPr>
-        <w:t xml:space="preserve">netmask: </w:t>
-      </w:r>
-      <w:r>
-        <w:rPr>
-          <w:rFonts w:ascii="Consolas" w:hAnsi="Consolas" w:eastAsia="Consolas" w:cs="Consolas"/>
-          <w:b w:val="0"/>
-          <w:bCs w:val="0"/>
-          <w:i w:val="0"/>
-          <w:iCs w:val="0"/>
-          <w:caps w:val="0"/>
-          <w:smallCaps w:val="0"/>
-          <w:color w:val="36ACAA"/>
-          <w:sz w:val="21"/>
-          <w:szCs w:val="21"/>
-          <w:lang w:val="en-US"/>
-        </w:rPr>
-        <w:t>255.255</w:t>
-      </w:r>
-      <w:r>
-        <w:rPr>
-          <w:rFonts w:ascii="Consolas" w:hAnsi="Consolas" w:eastAsia="Consolas" w:cs="Consolas"/>
-          <w:b w:val="0"/>
-          <w:bCs w:val="0"/>
-          <w:i w:val="0"/>
-          <w:iCs w:val="0"/>
-          <w:caps w:val="0"/>
-          <w:smallCaps w:val="0"/>
-          <w:color w:val="393A34"/>
-          <w:sz w:val="21"/>
-          <w:szCs w:val="21"/>
-          <w:lang w:val="en-US"/>
-        </w:rPr>
-        <w:t>.255.0</w:t>
-      </w:r>
-    </w:p>
-    <w:p>
-      <w:pPr>
-        <w:shd w:val="clear" w:color="auto" w:fill="F6F8FA"/>
-        <w:spacing w:before="0" w:beforeAutospacing="0" w:after="0" w:afterAutospacing="0" w:line="330" w:lineRule="auto"/>
-      </w:pPr>
-      <w:r>
-        <w:rPr>
-          <w:rFonts w:ascii="Consolas" w:hAnsi="Consolas" w:eastAsia="Consolas" w:cs="Consolas"/>
-          <w:b w:val="0"/>
-          <w:bCs w:val="0"/>
-          <w:i w:val="0"/>
-          <w:iCs w:val="0"/>
-          <w:caps w:val="0"/>
-          <w:smallCaps w:val="0"/>
-          <w:color w:val="393A34"/>
-          <w:sz w:val="21"/>
-          <w:szCs w:val="21"/>
-          <w:lang w:val="en-US"/>
-        </w:rPr>
-        <w:t xml:space="preserve">gateway: </w:t>
-      </w:r>
-      <w:r>
-        <w:rPr>
-          <w:rFonts w:ascii="Consolas" w:hAnsi="Consolas" w:eastAsia="Consolas" w:cs="Consolas"/>
-          <w:b w:val="0"/>
-          <w:bCs w:val="0"/>
-          <w:i w:val="0"/>
-          <w:iCs w:val="0"/>
-          <w:caps w:val="0"/>
-          <w:smallCaps w:val="0"/>
-          <w:color w:val="36ACAA"/>
-          <w:sz w:val="21"/>
-          <w:szCs w:val="21"/>
-          <w:lang w:val="en-US"/>
-        </w:rPr>
-        <w:t>192.168</w:t>
-      </w:r>
-      <w:r>
-        <w:rPr>
-          <w:rFonts w:ascii="Consolas" w:hAnsi="Consolas" w:eastAsia="Consolas" w:cs="Consolas"/>
-          <w:b w:val="0"/>
-          <w:bCs w:val="0"/>
-          <w:i w:val="0"/>
-          <w:iCs w:val="0"/>
-          <w:caps w:val="0"/>
-          <w:smallCaps w:val="0"/>
-          <w:color w:val="393A34"/>
-          <w:sz w:val="21"/>
-          <w:szCs w:val="21"/>
-          <w:lang w:val="en-US"/>
-        </w:rPr>
-        <w:t>.10.1</w:t>
-      </w:r>
-    </w:p>
-    <w:p>
-      <w:pPr>
-        <w:pStyle w:val="11"/>
-        <w:numPr>
-          <w:ilvl w:val="0"/>
-          <w:numId w:val="19"/>
-        </w:numPr>
-        <w:shd w:val="clear" w:color="auto" w:fill="FFFFFF" w:themeFill="background1"/>
-        <w:spacing w:before="240" w:beforeAutospacing="0" w:after="180" w:afterAutospacing="0" w:line="360" w:lineRule="auto"/>
-        <w:rPr>
-          <w:rFonts w:ascii="微软雅黑" w:hAnsi="微软雅黑" w:eastAsia="微软雅黑" w:cs="微软雅黑"/>
-          <w:b w:val="0"/>
-          <w:bCs w:val="0"/>
-          <w:i w:val="0"/>
-          <w:iCs w:val="0"/>
-          <w:caps w:val="0"/>
-          <w:smallCaps w:val="0"/>
-          <w:color w:val="172033"/>
-          <w:sz w:val="21"/>
-          <w:szCs w:val="21"/>
-          <w:lang w:val="en-US"/>
-        </w:rPr>
-      </w:pPr>
-      <w:r>
-        <w:rPr>
-          <w:rFonts w:ascii="微软雅黑" w:hAnsi="微软雅黑" w:eastAsia="微软雅黑" w:cs="微软雅黑"/>
-          <w:b w:val="0"/>
-          <w:bCs w:val="0"/>
-          <w:i w:val="0"/>
-          <w:iCs w:val="0"/>
-          <w:caps w:val="0"/>
-          <w:smallCaps w:val="0"/>
-          <w:color w:val="172033"/>
-          <w:sz w:val="21"/>
-          <w:szCs w:val="21"/>
-          <w:lang w:val="en-US"/>
-        </w:rPr>
-        <w:t>Use an Ethernet cable to connect the development computer and the robot. The robot's Ethernet port is shown in the figure.</w:t>
-      </w:r>
-    </w:p>
-    <w:p>
-      <w:pPr>
-        <w:shd w:val="clear" w:color="auto" w:fill="FFFFFF" w:themeFill="background1"/>
-        <w:spacing w:before="240" w:beforeAutospacing="0" w:after="180" w:afterAutospacing="0" w:line="360" w:lineRule="auto"/>
-      </w:pPr>
-      <w:r>
-        <w:drawing>
-          <wp:inline distT="0" distB="0" distL="114300" distR="114300">
-            <wp:extent cx="4354195" cy="3258820"/>
-            <wp:effectExtent l="0" t="0" r="14605" b="17780"/>
-            <wp:docPr id="1369006460" name="drawing" descr="/Users/xinzhang/Library/Containers/com.kingsoft.wpsoffice.mac/Data/tmp/picturecompress_20260923104501/output_7.pngoutput_7" title="image.png"/>
-            <wp:cNvGraphicFramePr>
-              <a:graphicFrameLocks xmlns:a="http://schemas.openxmlformats.org/drawingml/2006/main" noChangeAspect="1"/>
-            </wp:cNvGraphicFramePr>
-            <a:graphic xmlns:a="http://schemas.openxmlformats.org/drawingml/2006/main">
-              <a:graphicData uri="http://schemas.openxmlformats.org/drawingml/2006/picture">
-                <pic:pic xmlns:pic="http://schemas.openxmlformats.org/drawingml/2006/picture">
-                  <pic:nvPicPr>
-                    <pic:cNvPr id="1369006460" name="drawing" descr="/Users/xinzhang/Library/Containers/com.kingsoft.wpsoffice.mac/Data/tmp/picturecompress_20260923104501/output_7.pngoutput_7" title="image.png"/>
-                    <pic:cNvPicPr>
-                      <a:picLocks noChangeAspect="1"/>
-                    </pic:cNvPicPr>
-                  </pic:nvPicPr>
-                  <pic:blipFill>
-                    <a:blip r:embed="rId12"/>
-                    <a:stretch>
-                      <a:fillRect/>
-                    </a:stretch>
-                  </pic:blipFill>
-                  <pic:spPr>
-                    <a:xfrm>
-                      <a:off x="0" y="0"/>
-                      <a:ext cx="4354195" cy="3259113"/>
-                    </a:xfrm>
-                    <a:prstGeom prst="rect">
-                      <a:avLst/>
-                    </a:prstGeom>
-                  </pic:spPr>
-                </pic:pic>
-              </a:graphicData>
-            </a:graphic>
-          </wp:inline>
-        </w:drawing>
-      </w:r>
-    </w:p>
-    <w:p>
-      <w:pPr>
-        <w:pStyle w:val="11"/>
-        <w:numPr>
-          <w:ilvl w:val="0"/>
-          <w:numId w:val="19"/>
-        </w:numPr>
-        <w:shd w:val="clear" w:color="auto" w:fill="FFFFFF" w:themeFill="background1"/>
-        <w:spacing w:before="240" w:beforeAutospacing="0" w:after="180" w:afterAutospacing="0" w:line="360" w:lineRule="auto"/>
-        <w:rPr>
-          <w:rFonts w:ascii="微软雅黑" w:hAnsi="微软雅黑" w:eastAsia="微软雅黑" w:cs="微软雅黑"/>
-          <w:b w:val="0"/>
-          <w:bCs w:val="0"/>
-          <w:i w:val="0"/>
-          <w:iCs w:val="0"/>
-          <w:caps w:val="0"/>
-          <w:smallCaps w:val="0"/>
-          <w:color w:val="172033"/>
-          <w:sz w:val="21"/>
-          <w:szCs w:val="21"/>
-          <w:lang w:val="en-US"/>
-        </w:rPr>
-      </w:pPr>
-      <w:r>
-        <w:rPr>
-          <w:rFonts w:ascii="微软雅黑" w:hAnsi="微软雅黑" w:eastAsia="微软雅黑" w:cs="微软雅黑"/>
-          <w:b w:val="0"/>
-          <w:bCs w:val="0"/>
-          <w:i w:val="0"/>
-          <w:iCs w:val="0"/>
-          <w:caps w:val="0"/>
-          <w:smallCaps w:val="0"/>
-          <w:color w:val="172033"/>
-          <w:sz w:val="21"/>
-          <w:szCs w:val="21"/>
-          <w:lang w:val="en-US"/>
-        </w:rPr>
-        <w:t>Log in to the robot with SSH.</w:t>
-      </w:r>
-    </w:p>
-    <w:p>
-      <w:pPr>
-        <w:pStyle w:val="5"/>
-      </w:pPr>
-      <w:r>
-        <w:rPr>
-          <w:lang w:val="en-US"/>
-        </w:rPr>
-        <w:t>7.2.2 Wireless Connection</w:t>
-      </w:r>
-    </w:p>
-    <w:p>
-      <w:pPr>
-        <w:pStyle w:val="11"/>
-        <w:numPr>
-          <w:ilvl w:val="0"/>
-          <w:numId w:val="20"/>
-        </w:numPr>
-        <w:shd w:val="clear" w:color="auto" w:fill="FFFFFF" w:themeFill="background1"/>
-        <w:spacing w:before="0" w:beforeAutospacing="0" w:after="180" w:afterAutospacing="0" w:line="360" w:lineRule="auto"/>
-        <w:rPr>
-          <w:rFonts w:ascii="Consolas" w:hAnsi="Consolas" w:eastAsia="Consolas" w:cs="Consolas"/>
-          <w:b w:val="0"/>
-          <w:bCs w:val="0"/>
-          <w:i w:val="0"/>
-          <w:iCs w:val="0"/>
-          <w:caps w:val="0"/>
-          <w:smallCaps w:val="0"/>
-          <w:color w:val="1F2329"/>
-          <w:sz w:val="21"/>
-          <w:szCs w:val="21"/>
-          <w:lang w:val="en-US"/>
-        </w:rPr>
-      </w:pPr>
-      <w:r>
-        <w:rPr>
-          <w:rFonts w:ascii="微软雅黑" w:hAnsi="微软雅黑" w:eastAsia="微软雅黑" w:cs="微软雅黑"/>
-          <w:b w:val="0"/>
-          <w:bCs w:val="0"/>
-          <w:i w:val="0"/>
-          <w:iCs w:val="0"/>
-          <w:caps w:val="0"/>
-          <w:smallCaps w:val="0"/>
-          <w:color w:val="172033"/>
-          <w:sz w:val="21"/>
-          <w:szCs w:val="21"/>
-          <w:lang w:val="en-US"/>
-        </w:rPr>
-        <w:t>After connecting to the robot through the app and configuring Wi-Fi for the robot, you can see the robot's IP address.</w:t>
-      </w:r>
-      <w:r>
-        <w:rPr>
-          <w:rFonts w:ascii="Consolas" w:hAnsi="Consolas" w:eastAsia="Consolas" w:cs="Consolas"/>
-          <w:b w:val="0"/>
-          <w:bCs w:val="0"/>
-          <w:i w:val="0"/>
-          <w:iCs w:val="0"/>
-          <w:caps w:val="0"/>
-          <w:smallCaps w:val="0"/>
-          <w:color w:val="1F2329"/>
-          <w:sz w:val="21"/>
-          <w:szCs w:val="21"/>
-          <w:lang w:val="en-US"/>
-        </w:rPr>
-        <w:t>xxx.xxx.xxx.xxx</w:t>
-      </w:r>
-    </w:p>
-    <w:p>
-      <w:pPr>
-        <w:pStyle w:val="11"/>
-        <w:numPr>
-          <w:ilvl w:val="0"/>
-          <w:numId w:val="20"/>
-        </w:numPr>
-        <w:shd w:val="clear" w:color="auto" w:fill="FFFFFF" w:themeFill="background1"/>
-        <w:spacing w:before="60" w:beforeAutospacing="0" w:after="180" w:afterAutospacing="0" w:line="360" w:lineRule="auto"/>
-        <w:rPr>
-          <w:rFonts w:ascii="微软雅黑" w:hAnsi="微软雅黑" w:eastAsia="微软雅黑" w:cs="微软雅黑"/>
-          <w:b w:val="0"/>
-          <w:bCs w:val="0"/>
-          <w:i w:val="0"/>
-          <w:iCs w:val="0"/>
-          <w:caps w:val="0"/>
-          <w:smallCaps w:val="0"/>
-          <w:color w:val="172033"/>
-          <w:sz w:val="21"/>
-          <w:szCs w:val="21"/>
-          <w:lang w:val="en-US"/>
-        </w:rPr>
-      </w:pPr>
-      <w:r>
-        <w:rPr>
-          <w:rFonts w:ascii="微软雅黑" w:hAnsi="微软雅黑" w:eastAsia="微软雅黑" w:cs="微软雅黑"/>
-          <w:b w:val="0"/>
-          <w:bCs w:val="0"/>
-          <w:i w:val="0"/>
-          <w:iCs w:val="0"/>
-          <w:caps w:val="0"/>
-          <w:smallCaps w:val="0"/>
-          <w:color w:val="172033"/>
-          <w:sz w:val="21"/>
-          <w:szCs w:val="21"/>
-          <w:lang w:val="en-US"/>
-        </w:rPr>
-        <w:t>Log in to the robot with SSH.</w:t>
-      </w:r>
-    </w:p>
-    <w:p>
-      <w:pPr>
-        <w:pStyle w:val="3"/>
-        <w:numPr>
-          <w:ilvl w:val="0"/>
-          <w:numId w:val="17"/>
-        </w:numPr>
-      </w:pPr>
-      <w:r>
-        <w:rPr>
-          <w:lang w:val="en-US"/>
-        </w:rPr>
-        <w:t>Use Agents</w:t>
-      </w:r>
-    </w:p>
-    <w:p>
-      <w:pPr>
-        <w:pStyle w:val="4"/>
-      </w:pPr>
-      <w:r>
-        <w:rPr>
-          <w:lang w:val="en-US"/>
-        </w:rPr>
-        <w:t>8.1 What Is an Agent?</w:t>
-      </w:r>
-    </w:p>
-    <w:p>
-      <w:pPr>
-        <w:shd w:val="clear" w:color="auto" w:fill="FFFFFF" w:themeFill="background1"/>
-        <w:spacing w:before="0" w:beforeAutospacing="0" w:after="180" w:afterAutospacing="0" w:line="360" w:lineRule="auto"/>
-      </w:pPr>
-      <w:r>
-        <w:rPr>
-          <w:rFonts w:ascii="微软雅黑" w:hAnsi="微软雅黑" w:eastAsia="微软雅黑" w:cs="微软雅黑"/>
-          <w:b w:val="0"/>
-          <w:bCs w:val="0"/>
-          <w:i w:val="0"/>
-          <w:iCs w:val="0"/>
-          <w:caps w:val="0"/>
-          <w:smallCaps w:val="0"/>
-          <w:color w:val="172033"/>
-          <w:sz w:val="21"/>
-          <w:szCs w:val="21"/>
-          <w:lang w:val="en-US"/>
-        </w:rPr>
-        <w:t>An Agent is a "skill pack" installed in the robot's brain. It can also be understood as an application running on the robot. Like switching apps on a phone, switching Agents lets the robot enter the corresponding capability scenario and use different interaction methods and task capabilities.</w:t>
-      </w:r>
-    </w:p>
-    <w:p>
-      <w:pPr>
-        <w:pStyle w:val="4"/>
-      </w:pPr>
-      <w:r>
-        <w:rPr>
-          <w:lang w:val="en-US"/>
-        </w:rPr>
-        <w:t>8.2 How to Switch Agents</w:t>
-      </w:r>
-    </w:p>
-    <w:p>
-      <w:pPr>
-        <w:pStyle w:val="11"/>
-        <w:numPr>
-          <w:ilvl w:val="0"/>
-          <w:numId w:val="21"/>
-        </w:numPr>
-        <w:shd w:val="clear" w:color="auto" w:fill="FFFFFF" w:themeFill="background1"/>
-        <w:spacing w:before="240" w:beforeAutospacing="0" w:after="180" w:afterAutospacing="0" w:line="360" w:lineRule="auto"/>
-        <w:rPr>
-          <w:rFonts w:ascii="微软雅黑" w:hAnsi="微软雅黑" w:eastAsia="微软雅黑" w:cs="微软雅黑"/>
-          <w:b/>
-          <w:bCs/>
-          <w:i w:val="0"/>
-          <w:iCs w:val="0"/>
-          <w:caps w:val="0"/>
-          <w:smallCaps w:val="0"/>
-          <w:color w:val="172033"/>
-          <w:sz w:val="21"/>
-          <w:szCs w:val="21"/>
-          <w:lang w:val="en-US"/>
-        </w:rPr>
-      </w:pPr>
-      <w:r>
-        <w:rPr>
-          <w:rFonts w:ascii="微软雅黑" w:hAnsi="微软雅黑" w:eastAsia="微软雅黑" w:cs="微软雅黑"/>
-          <w:b/>
-          <w:bCs/>
-          <w:i w:val="0"/>
-          <w:iCs w:val="0"/>
-          <w:caps w:val="0"/>
-          <w:smallCaps w:val="0"/>
-          <w:color w:val="172033"/>
-          <w:sz w:val="21"/>
-          <w:szCs w:val="21"/>
-          <w:lang w:val="en-US"/>
-        </w:rPr>
-        <w:t>Switch via the mobile App</w:t>
-      </w:r>
-    </w:p>
-    <w:p>
-      <w:pPr>
-        <w:pStyle w:val="11"/>
-        <w:numPr>
-          <w:ilvl w:val="1"/>
-          <w:numId w:val="21"/>
-        </w:numPr>
-        <w:shd w:val="clear" w:color="auto" w:fill="FFFFFF" w:themeFill="background1"/>
-        <w:spacing w:before="0" w:beforeAutospacing="0" w:after="180" w:afterAutospacing="0" w:line="360" w:lineRule="auto"/>
-        <w:rPr>
-          <w:rFonts w:ascii="微软雅黑" w:hAnsi="微软雅黑" w:eastAsia="微软雅黑" w:cs="微软雅黑"/>
-          <w:b w:val="0"/>
-          <w:bCs w:val="0"/>
-          <w:i w:val="0"/>
-          <w:iCs w:val="0"/>
-          <w:caps w:val="0"/>
-          <w:smallCaps w:val="0"/>
-          <w:color w:val="172033"/>
-          <w:sz w:val="21"/>
-          <w:szCs w:val="21"/>
-          <w:lang w:val="en-US"/>
-        </w:rPr>
-      </w:pPr>
-      <w:r>
-        <w:rPr>
-          <w:rFonts w:ascii="微软雅黑" w:hAnsi="微软雅黑" w:eastAsia="微软雅黑" w:cs="微软雅黑"/>
-          <w:b w:val="0"/>
-          <w:bCs w:val="0"/>
-          <w:i w:val="0"/>
-          <w:iCs w:val="0"/>
-          <w:caps w:val="0"/>
-          <w:smallCaps w:val="0"/>
-          <w:color w:val="172033"/>
-          <w:sz w:val="21"/>
-          <w:szCs w:val="21"/>
-          <w:lang w:val="en-US"/>
-        </w:rPr>
-        <w:t>Tap the Agent name in the top-left corner to switch to another Agent. Each Agent has different capabilities — for example, Soccer Master can play soccer with you, Hi Chat can talk with you using different personas, and Dance Master can perform a variety of dances from around the world.</w:t>
-      </w:r>
-    </w:p>
-    <w:p>
-      <w:pPr>
-        <w:pStyle w:val="11"/>
-        <w:numPr>
-          <w:ilvl w:val="0"/>
-          <w:numId w:val="21"/>
         </w:numPr>
         <w:shd w:val="clear" w:color="auto" w:fill="FFFFFF" w:themeFill="background1"/>
         <w:spacing w:before="240" w:beforeAutospacing="0" w:after="180" w:afterAutospacing="0" w:line="360" w:lineRule="auto"/>
@@ -33670,7 +32732,7 @@
         <w:pStyle w:val="11"/>
         <w:numPr>
           <w:ilvl w:val="0"/>
-          <w:numId w:val="22"/>
+          <w:numId w:val="19"/>
         </w:numPr>
         <w:shd w:val="clear" w:color="auto" w:fill="FFFFFF" w:themeFill="background1"/>
         <w:spacing w:before="240" w:beforeAutospacing="0" w:after="180" w:afterAutospacing="0" w:line="360" w:lineRule="auto"/>
@@ -33710,7 +32772,7 @@
         <w:pStyle w:val="11"/>
         <w:numPr>
           <w:ilvl w:val="0"/>
-          <w:numId w:val="22"/>
+          <w:numId w:val="19"/>
         </w:numPr>
         <w:shd w:val="clear" w:color="auto" w:fill="FFFFFF" w:themeFill="background1"/>
         <w:spacing w:before="240" w:beforeAutospacing="0" w:after="180" w:afterAutospacing="0" w:line="360" w:lineRule="auto"/>
@@ -33761,7 +32823,7 @@
         <w:pStyle w:val="11"/>
         <w:numPr>
           <w:ilvl w:val="0"/>
-          <w:numId w:val="23"/>
+          <w:numId w:val="20"/>
         </w:numPr>
         <w:shd w:val="clear" w:color="auto" w:fill="FFFFFF" w:themeFill="background1"/>
         <w:spacing w:before="0" w:beforeAutospacing="0" w:after="180" w:afterAutospacing="0" w:line="360" w:lineRule="auto"/>
@@ -33847,7 +32909,7 @@
         <w:pStyle w:val="11"/>
         <w:numPr>
           <w:ilvl w:val="0"/>
-          <w:numId w:val="23"/>
+          <w:numId w:val="20"/>
         </w:numPr>
         <w:shd w:val="clear" w:color="auto" w:fill="FFFFFF" w:themeFill="background1"/>
         <w:spacing w:before="60" w:beforeAutospacing="0" w:after="180" w:afterAutospacing="0" w:line="360" w:lineRule="auto"/>
@@ -33936,7 +32998,7 @@
         <w:pStyle w:val="11"/>
         <w:numPr>
           <w:ilvl w:val="0"/>
-          <w:numId w:val="24"/>
+          <w:numId w:val="21"/>
         </w:numPr>
         <w:shd w:val="clear" w:color="auto" w:fill="FFFFFF" w:themeFill="background1"/>
         <w:spacing w:before="0" w:beforeAutospacing="0" w:after="180" w:afterAutospacing="0" w:line="360" w:lineRule="auto"/>
@@ -33981,7 +33043,7 @@
           <wp:inline distT="0" distB="0" distL="114300" distR="114300">
             <wp:extent cx="5667375" cy="2599055"/>
             <wp:effectExtent l="0" t="0" r="22225" b="17145"/>
-            <wp:docPr id="1295475077" name="drawing" descr="/Users/xinzhang/Library/Containers/com.kingsoft.wpsoffice.mac/Data/tmp/picturecompress_20260923104501/output_8.pngoutput_8" title="Feishu whiteboard"/>
+            <wp:docPr id="1295475077" name="drawing" descr="/Users/xinzhang/Library/Containers/com.kingsoft.wpsoffice.mac/Data/tmp/picturecompress_20260925230408/output_6.pngoutput_6" title="Feishu whiteboard"/>
             <wp:cNvGraphicFramePr>
               <a:graphicFrameLocks xmlns:a="http://schemas.openxmlformats.org/drawingml/2006/main" noChangeAspect="1"/>
             </wp:cNvGraphicFramePr>
@@ -33989,13 +33051,13 @@
               <a:graphicData uri="http://schemas.openxmlformats.org/drawingml/2006/picture">
                 <pic:pic xmlns:pic="http://schemas.openxmlformats.org/drawingml/2006/picture">
                   <pic:nvPicPr>
-                    <pic:cNvPr id="1295475077" name="drawing" descr="/Users/xinzhang/Library/Containers/com.kingsoft.wpsoffice.mac/Data/tmp/picturecompress_20260923104501/output_8.pngoutput_8" title="Feishu whiteboard"/>
+                    <pic:cNvPr id="1295475077" name="drawing" descr="/Users/xinzhang/Library/Containers/com.kingsoft.wpsoffice.mac/Data/tmp/picturecompress_20260925230408/output_6.pngoutput_6" title="Feishu whiteboard"/>
                     <pic:cNvPicPr>
                       <a:picLocks noChangeAspect="1"/>
                     </pic:cNvPicPr>
                   </pic:nvPicPr>
                   <pic:blipFill>
-                    <a:blip r:embed="rId13"/>
+                    <a:blip r:embed="rId11"/>
                     <a:stretch>
                       <a:fillRect/>
                     </a:stretch>
@@ -34021,7 +33083,7 @@
         <w:pStyle w:val="11"/>
         <w:numPr>
           <w:ilvl w:val="0"/>
-          <w:numId w:val="25"/>
+          <w:numId w:val="22"/>
         </w:numPr>
         <w:shd w:val="clear" w:color="auto" w:fill="FFFFFF" w:themeFill="background1"/>
         <w:spacing w:before="0" w:beforeAutospacing="0" w:after="180" w:afterAutospacing="0" w:line="360" w:lineRule="auto"/>
@@ -34066,7 +33128,7 @@
           <wp:inline distT="0" distB="0" distL="114300" distR="114300">
             <wp:extent cx="5774690" cy="2299970"/>
             <wp:effectExtent l="0" t="0" r="16510" b="11430"/>
-            <wp:docPr id="1002308124" name="drawing" descr="/Users/xinzhang/Library/Containers/com.kingsoft.wpsoffice.mac/Data/tmp/picturecompress_20260923104501/output_9.pngoutput_9" title="Feishu whiteboard"/>
+            <wp:docPr id="1002308124" name="drawing" descr="/Users/xinzhang/Library/Containers/com.kingsoft.wpsoffice.mac/Data/tmp/picturecompress_20260925230408/output_7.pngoutput_7" title="Feishu whiteboard"/>
             <wp:cNvGraphicFramePr>
               <a:graphicFrameLocks xmlns:a="http://schemas.openxmlformats.org/drawingml/2006/main" noChangeAspect="1"/>
             </wp:cNvGraphicFramePr>
@@ -34074,13 +33136,13 @@
               <a:graphicData uri="http://schemas.openxmlformats.org/drawingml/2006/picture">
                 <pic:pic xmlns:pic="http://schemas.openxmlformats.org/drawingml/2006/picture">
                   <pic:nvPicPr>
-                    <pic:cNvPr id="1002308124" name="drawing" descr="/Users/xinzhang/Library/Containers/com.kingsoft.wpsoffice.mac/Data/tmp/picturecompress_20260923104501/output_9.pngoutput_9" title="Feishu whiteboard"/>
+                    <pic:cNvPr id="1002308124" name="drawing" descr="/Users/xinzhang/Library/Containers/com.kingsoft.wpsoffice.mac/Data/tmp/picturecompress_20260925230408/output_7.pngoutput_7" title="Feishu whiteboard"/>
                     <pic:cNvPicPr>
                       <a:picLocks noChangeAspect="1"/>
                     </pic:cNvPicPr>
                   </pic:nvPicPr>
                   <pic:blipFill>
-                    <a:blip r:embed="rId14"/>
+                    <a:blip r:embed="rId12"/>
                     <a:stretch>
                       <a:fillRect/>
                     </a:stretch>
@@ -34117,7 +33179,7 @@
         <w:pStyle w:val="11"/>
         <w:numPr>
           <w:ilvl w:val="0"/>
-          <w:numId w:val="26"/>
+          <w:numId w:val="23"/>
         </w:numPr>
         <w:shd w:val="clear" w:color="auto" w:fill="FFFFFF" w:themeFill="background1"/>
         <w:spacing w:before="0" w:beforeAutospacing="0" w:after="180" w:afterAutospacing="0" w:line="360" w:lineRule="auto"/>
@@ -34162,7 +33224,7 @@
           <wp:inline distT="0" distB="0" distL="114300" distR="114300">
             <wp:extent cx="4752975" cy="2543175"/>
             <wp:effectExtent l="0" t="0" r="22225" b="22225"/>
-            <wp:docPr id="1451928190" name="drawing" descr="/Users/xinzhang/Library/Containers/com.kingsoft.wpsoffice.mac/Data/tmp/picturecompress_20260923104501/output_10.pngoutput_10" title="Feishu whiteboard"/>
+            <wp:docPr id="1451928190" name="drawing" descr="/Users/xinzhang/Library/Containers/com.kingsoft.wpsoffice.mac/Data/tmp/picturecompress_20260925230408/output_8.pngoutput_8" title="Feishu whiteboard"/>
             <wp:cNvGraphicFramePr>
               <a:graphicFrameLocks xmlns:a="http://schemas.openxmlformats.org/drawingml/2006/main" noChangeAspect="1"/>
             </wp:cNvGraphicFramePr>
@@ -34170,13 +33232,13 @@
               <a:graphicData uri="http://schemas.openxmlformats.org/drawingml/2006/picture">
                 <pic:pic xmlns:pic="http://schemas.openxmlformats.org/drawingml/2006/picture">
                   <pic:nvPicPr>
-                    <pic:cNvPr id="1451928190" name="drawing" descr="/Users/xinzhang/Library/Containers/com.kingsoft.wpsoffice.mac/Data/tmp/picturecompress_20260923104501/output_10.pngoutput_10" title="Feishu whiteboard"/>
+                    <pic:cNvPr id="1451928190" name="drawing" descr="/Users/xinzhang/Library/Containers/com.kingsoft.wpsoffice.mac/Data/tmp/picturecompress_20260925230408/output_8.pngoutput_8" title="Feishu whiteboard"/>
                     <pic:cNvPicPr>
                       <a:picLocks noChangeAspect="1"/>
                     </pic:cNvPicPr>
                   </pic:nvPicPr>
                   <pic:blipFill>
-                    <a:blip r:embed="rId15"/>
+                    <a:blip r:embed="rId13"/>
                     <a:stretch>
                       <a:fillRect/>
                     </a:stretch>
@@ -34202,7 +33264,7 @@
         <w:pStyle w:val="11"/>
         <w:numPr>
           <w:ilvl w:val="0"/>
-          <w:numId w:val="27"/>
+          <w:numId w:val="24"/>
         </w:numPr>
         <w:shd w:val="clear" w:color="auto" w:fill="FFFFFF" w:themeFill="background1"/>
         <w:spacing w:before="0" w:beforeAutospacing="0" w:after="180" w:afterAutospacing="0" w:line="360" w:lineRule="auto"/>
@@ -34247,7 +33309,7 @@
           <wp:inline distT="0" distB="0" distL="114300" distR="114300">
             <wp:extent cx="5106670" cy="4381500"/>
             <wp:effectExtent l="0" t="0" r="24130" b="12700"/>
-            <wp:docPr id="831722974" name="drawing" descr="/Users/xinzhang/Library/Containers/com.kingsoft.wpsoffice.mac/Data/tmp/picturecompress_20260923104501/output_11.pngoutput_11" title="Feishu whiteboard"/>
+            <wp:docPr id="831722974" name="drawing" descr="/Users/xinzhang/Library/Containers/com.kingsoft.wpsoffice.mac/Data/tmp/picturecompress_20260925230408/output_9.pngoutput_9" title="Feishu whiteboard"/>
             <wp:cNvGraphicFramePr>
               <a:graphicFrameLocks xmlns:a="http://schemas.openxmlformats.org/drawingml/2006/main" noChangeAspect="1"/>
             </wp:cNvGraphicFramePr>
@@ -34255,13 +33317,13 @@
               <a:graphicData uri="http://schemas.openxmlformats.org/drawingml/2006/picture">
                 <pic:pic xmlns:pic="http://schemas.openxmlformats.org/drawingml/2006/picture">
                   <pic:nvPicPr>
-                    <pic:cNvPr id="831722974" name="drawing" descr="/Users/xinzhang/Library/Containers/com.kingsoft.wpsoffice.mac/Data/tmp/picturecompress_20260923104501/output_11.pngoutput_11" title="Feishu whiteboard"/>
+                    <pic:cNvPr id="831722974" name="drawing" descr="/Users/xinzhang/Library/Containers/com.kingsoft.wpsoffice.mac/Data/tmp/picturecompress_20260925230408/output_9.pngoutput_9" title="Feishu whiteboard"/>
                     <pic:cNvPicPr>
                       <a:picLocks noChangeAspect="1"/>
                     </pic:cNvPicPr>
                   </pic:nvPicPr>
                   <pic:blipFill>
-                    <a:blip r:embed="rId16"/>
+                    <a:blip r:embed="rId14"/>
                     <a:stretch>
                       <a:fillRect/>
                     </a:stretch>
@@ -34444,7 +33506,7 @@
         <w:pStyle w:val="11"/>
         <w:numPr>
           <w:ilvl w:val="0"/>
-          <w:numId w:val="28"/>
+          <w:numId w:val="25"/>
         </w:numPr>
         <w:suppressLineNumbers w:val="0"/>
         <w:shd w:val="clear" w:color="auto" w:fill="FFFFFF" w:themeFill="background1"/>
@@ -34540,7 +33602,7 @@
         <w:pStyle w:val="11"/>
         <w:numPr>
           <w:ilvl w:val="0"/>
-          <w:numId w:val="28"/>
+          <w:numId w:val="25"/>
         </w:numPr>
         <w:shd w:val="clear" w:color="auto" w:fill="FFFFFF" w:themeFill="background1"/>
         <w:spacing w:before="60" w:beforeAutospacing="0" w:after="180" w:afterAutospacing="0" w:line="360" w:lineRule="auto"/>
@@ -34599,7 +33661,7 @@
         <w:pStyle w:val="11"/>
         <w:numPr>
           <w:ilvl w:val="0"/>
-          <w:numId w:val="28"/>
+          <w:numId w:val="25"/>
         </w:numPr>
         <w:shd w:val="clear" w:color="auto" w:fill="FFFFFF" w:themeFill="background1"/>
         <w:spacing w:before="60" w:beforeAutospacing="0" w:after="180" w:afterAutospacing="0" w:line="360" w:lineRule="auto"/>
@@ -35909,7 +34971,7 @@
         <w:pStyle w:val="11"/>
         <w:numPr>
           <w:ilvl w:val="0"/>
-          <w:numId w:val="29"/>
+          <w:numId w:val="26"/>
         </w:numPr>
         <w:shd w:val="clear" w:color="auto" w:fill="FFFFFF" w:themeFill="background1"/>
         <w:spacing w:before="0" w:beforeAutospacing="0" w:after="180" w:afterAutospacing="0" w:line="360" w:lineRule="auto"/>
@@ -35949,7 +35011,7 @@
         <w:pStyle w:val="11"/>
         <w:numPr>
           <w:ilvl w:val="0"/>
-          <w:numId w:val="29"/>
+          <w:numId w:val="26"/>
         </w:numPr>
         <w:shd w:val="clear" w:color="auto" w:fill="FFFFFF" w:themeFill="background1"/>
         <w:spacing w:before="60" w:beforeAutospacing="0" w:after="180" w:afterAutospacing="0" w:line="360" w:lineRule="auto"/>
@@ -35989,7 +35051,7 @@
         <w:pStyle w:val="11"/>
         <w:numPr>
           <w:ilvl w:val="0"/>
-          <w:numId w:val="29"/>
+          <w:numId w:val="26"/>
         </w:numPr>
         <w:shd w:val="clear" w:color="auto" w:fill="FFFFFF" w:themeFill="background1"/>
         <w:spacing w:before="60" w:beforeAutospacing="0" w:after="180" w:afterAutospacing="0" w:line="360" w:lineRule="auto"/>
@@ -36062,7 +35124,7 @@
         <w:pStyle w:val="11"/>
         <w:numPr>
           <w:ilvl w:val="0"/>
-          <w:numId w:val="30"/>
+          <w:numId w:val="27"/>
         </w:numPr>
         <w:shd w:val="clear" w:color="auto" w:fill="FFFFFF" w:themeFill="background1"/>
         <w:spacing w:before="240" w:beforeAutospacing="0" w:after="180" w:afterAutospacing="0" w:line="360" w:lineRule="auto"/>
@@ -36632,7 +35694,7 @@
         <w:pStyle w:val="3"/>
         <w:numPr>
           <w:ilvl w:val="0"/>
-          <w:numId w:val="31"/>
+          <w:numId w:val="28"/>
         </w:numPr>
         <w:rPr>
           <w:sz w:val="24"/>
@@ -36692,7 +35754,7 @@
         <w:pStyle w:val="11"/>
         <w:numPr>
           <w:ilvl w:val="0"/>
-          <w:numId w:val="32"/>
+          <w:numId w:val="29"/>
         </w:numPr>
         <w:shd w:val="clear" w:color="auto" w:fill="FFFFFF" w:themeFill="background1"/>
         <w:spacing w:before="0" w:beforeAutospacing="0" w:after="180" w:afterAutospacing="0" w:line="360" w:lineRule="auto"/>
@@ -36732,7 +35794,7 @@
         <w:pStyle w:val="11"/>
         <w:numPr>
           <w:ilvl w:val="0"/>
-          <w:numId w:val="32"/>
+          <w:numId w:val="29"/>
         </w:numPr>
         <w:shd w:val="clear" w:color="auto" w:fill="FFFFFF" w:themeFill="background1"/>
         <w:spacing w:before="60" w:beforeAutospacing="0" w:after="180" w:afterAutospacing="0" w:line="360" w:lineRule="auto"/>
@@ -36772,7 +35834,7 @@
         <w:pStyle w:val="11"/>
         <w:numPr>
           <w:ilvl w:val="0"/>
-          <w:numId w:val="32"/>
+          <w:numId w:val="29"/>
         </w:numPr>
         <w:shd w:val="clear" w:color="auto" w:fill="FFFFFF" w:themeFill="background1"/>
         <w:spacing w:before="60" w:beforeAutospacing="0" w:after="180" w:afterAutospacing="0" w:line="360" w:lineRule="auto"/>
@@ -36867,7 +35929,7 @@
         <w:pStyle w:val="11"/>
         <w:numPr>
           <w:ilvl w:val="0"/>
-          <w:numId w:val="33"/>
+          <w:numId w:val="30"/>
         </w:numPr>
         <w:shd w:val="clear" w:color="auto" w:fill="FFFFFF" w:themeFill="background1"/>
         <w:spacing w:before="0" w:beforeAutospacing="0" w:after="180" w:afterAutospacing="0" w:line="360" w:lineRule="auto"/>
@@ -36907,7 +35969,7 @@
         <w:pStyle w:val="11"/>
         <w:numPr>
           <w:ilvl w:val="0"/>
-          <w:numId w:val="33"/>
+          <w:numId w:val="30"/>
         </w:numPr>
         <w:shd w:val="clear" w:color="auto" w:fill="FFFFFF" w:themeFill="background1"/>
         <w:spacing w:before="60" w:beforeAutospacing="0" w:after="180" w:afterAutospacing="0" w:line="360" w:lineRule="auto"/>
@@ -36947,7 +36009,7 @@
         <w:pStyle w:val="11"/>
         <w:numPr>
           <w:ilvl w:val="0"/>
-          <w:numId w:val="33"/>
+          <w:numId w:val="30"/>
         </w:numPr>
         <w:shd w:val="clear" w:color="auto" w:fill="FFFFFF" w:themeFill="background1"/>
         <w:spacing w:before="60" w:beforeAutospacing="0" w:after="180" w:afterAutospacing="0" w:line="360" w:lineRule="auto"/>
@@ -37039,7 +36101,7 @@
         <w:pStyle w:val="11"/>
         <w:numPr>
           <w:ilvl w:val="0"/>
-          <w:numId w:val="34"/>
+          <w:numId w:val="31"/>
         </w:numPr>
         <w:shd w:val="clear" w:color="auto" w:fill="FFFFFF" w:themeFill="background1"/>
         <w:spacing w:before="0" w:beforeAutospacing="0" w:after="180" w:afterAutospacing="0" w:line="360" w:lineRule="auto"/>
@@ -37079,7 +36141,7 @@
         <w:pStyle w:val="11"/>
         <w:numPr>
           <w:ilvl w:val="0"/>
-          <w:numId w:val="34"/>
+          <w:numId w:val="31"/>
         </w:numPr>
         <w:shd w:val="clear" w:color="auto" w:fill="FFFFFF" w:themeFill="background1"/>
         <w:spacing w:before="60" w:beforeAutospacing="0" w:after="180" w:afterAutospacing="0" w:line="360" w:lineRule="auto"/>
@@ -37119,7 +36181,7 @@
         <w:pStyle w:val="11"/>
         <w:numPr>
           <w:ilvl w:val="0"/>
-          <w:numId w:val="34"/>
+          <w:numId w:val="31"/>
         </w:numPr>
         <w:shd w:val="clear" w:color="auto" w:fill="FFFFFF" w:themeFill="background1"/>
         <w:spacing w:before="60" w:beforeAutospacing="0" w:after="180" w:afterAutospacing="0" w:line="360" w:lineRule="auto"/>
@@ -37159,7 +36221,7 @@
         <w:pStyle w:val="11"/>
         <w:numPr>
           <w:ilvl w:val="0"/>
-          <w:numId w:val="34"/>
+          <w:numId w:val="31"/>
         </w:numPr>
         <w:shd w:val="clear" w:color="auto" w:fill="FFFFFF" w:themeFill="background1"/>
         <w:spacing w:before="60" w:beforeAutospacing="0" w:after="180" w:afterAutospacing="0" w:line="360" w:lineRule="auto"/>
@@ -37297,7 +36359,7 @@
         <w:pStyle w:val="11"/>
         <w:numPr>
           <w:ilvl w:val="0"/>
-          <w:numId w:val="35"/>
+          <w:numId w:val="32"/>
         </w:numPr>
         <w:shd w:val="clear" w:color="auto" w:fill="FFFFFF" w:themeFill="background1"/>
         <w:spacing w:before="0" w:beforeAutospacing="0" w:after="180" w:afterAutospacing="0" w:line="360" w:lineRule="auto"/>
@@ -37337,7 +36399,7 @@
         <w:pStyle w:val="11"/>
         <w:numPr>
           <w:ilvl w:val="0"/>
-          <w:numId w:val="35"/>
+          <w:numId w:val="32"/>
         </w:numPr>
         <w:shd w:val="clear" w:color="auto" w:fill="FFFFFF" w:themeFill="background1"/>
         <w:spacing w:before="60" w:beforeAutospacing="0" w:after="180" w:afterAutospacing="0" w:line="360" w:lineRule="auto"/>
@@ -37377,7 +36439,7 @@
         <w:pStyle w:val="11"/>
         <w:numPr>
           <w:ilvl w:val="0"/>
-          <w:numId w:val="35"/>
+          <w:numId w:val="32"/>
         </w:numPr>
         <w:shd w:val="clear" w:color="auto" w:fill="FFFFFF" w:themeFill="background1"/>
         <w:spacing w:before="60" w:beforeAutospacing="0" w:after="180" w:afterAutospacing="0" w:line="360" w:lineRule="auto"/>
@@ -37417,7 +36479,7 @@
         <w:pStyle w:val="11"/>
         <w:numPr>
           <w:ilvl w:val="0"/>
-          <w:numId w:val="35"/>
+          <w:numId w:val="32"/>
         </w:numPr>
         <w:shd w:val="clear" w:color="auto" w:fill="FFFFFF" w:themeFill="background1"/>
         <w:spacing w:before="60" w:beforeAutospacing="0" w:after="180" w:afterAutospacing="0" w:line="360" w:lineRule="auto"/>
@@ -37457,7 +36519,7 @@
         <w:pStyle w:val="11"/>
         <w:numPr>
           <w:ilvl w:val="0"/>
-          <w:numId w:val="35"/>
+          <w:numId w:val="32"/>
         </w:numPr>
         <w:shd w:val="clear" w:color="auto" w:fill="FFFFFF" w:themeFill="background1"/>
         <w:spacing w:before="60" w:beforeAutospacing="0" w:after="180" w:afterAutospacing="0" w:line="360" w:lineRule="auto"/>
@@ -37536,7 +36598,7 @@
         <w:pStyle w:val="11"/>
         <w:numPr>
           <w:ilvl w:val="0"/>
-          <w:numId w:val="36"/>
+          <w:numId w:val="33"/>
         </w:numPr>
         <w:shd w:val="clear" w:color="auto" w:fill="FFFFFF" w:themeFill="background1"/>
         <w:spacing w:before="240" w:beforeAutospacing="0" w:after="180" w:afterAutospacing="0" w:line="360" w:lineRule="auto"/>
@@ -37619,7 +36681,7 @@
         <w:pStyle w:val="11"/>
         <w:numPr>
           <w:ilvl w:val="0"/>
-          <w:numId w:val="36"/>
+          <w:numId w:val="33"/>
         </w:numPr>
         <w:shd w:val="clear" w:color="auto" w:fill="FFFFFF" w:themeFill="background1"/>
         <w:spacing w:before="240" w:beforeAutospacing="0" w:after="180" w:afterAutospacing="0" w:line="360" w:lineRule="auto"/>
@@ -37691,7 +36753,7 @@
         <w:pStyle w:val="11"/>
         <w:numPr>
           <w:ilvl w:val="0"/>
-          <w:numId w:val="36"/>
+          <w:numId w:val="33"/>
         </w:numPr>
         <w:shd w:val="clear" w:color="auto" w:fill="FFFFFF" w:themeFill="background1"/>
         <w:spacing w:before="240" w:beforeAutospacing="0" w:after="180" w:afterAutospacing="0" w:line="360" w:lineRule="auto"/>
@@ -37731,7 +36793,7 @@
         <w:pStyle w:val="11"/>
         <w:numPr>
           <w:ilvl w:val="0"/>
-          <w:numId w:val="36"/>
+          <w:numId w:val="33"/>
         </w:numPr>
         <w:shd w:val="clear" w:color="auto" w:fill="FFFFFF" w:themeFill="background1"/>
         <w:spacing w:before="240" w:beforeAutospacing="0" w:after="180" w:afterAutospacing="0" w:line="360" w:lineRule="auto"/>
@@ -37803,7 +36865,7 @@
         <w:pStyle w:val="11"/>
         <w:numPr>
           <w:ilvl w:val="0"/>
-          <w:numId w:val="36"/>
+          <w:numId w:val="33"/>
         </w:numPr>
         <w:shd w:val="clear" w:color="auto" w:fill="FFFFFF" w:themeFill="background1"/>
         <w:spacing w:before="240" w:beforeAutospacing="0" w:after="180" w:afterAutospacing="0" w:line="360" w:lineRule="auto"/>
@@ -37922,7 +36984,7 @@
         <w:pStyle w:val="11"/>
         <w:numPr>
           <w:ilvl w:val="0"/>
-          <w:numId w:val="37"/>
+          <w:numId w:val="34"/>
         </w:numPr>
         <w:shd w:val="clear" w:color="auto" w:fill="FFFFFF" w:themeFill="background1"/>
         <w:spacing w:before="0" w:beforeAutospacing="0" w:after="180" w:afterAutospacing="0" w:line="360" w:lineRule="auto"/>
@@ -37962,7 +37024,7 @@
         <w:pStyle w:val="11"/>
         <w:numPr>
           <w:ilvl w:val="0"/>
-          <w:numId w:val="37"/>
+          <w:numId w:val="34"/>
         </w:numPr>
         <w:shd w:val="clear" w:color="auto" w:fill="FFFFFF" w:themeFill="background1"/>
         <w:spacing w:before="60" w:beforeAutospacing="0" w:after="180" w:afterAutospacing="0" w:line="360" w:lineRule="auto"/>
@@ -38002,7 +37064,7 @@
         <w:pStyle w:val="11"/>
         <w:numPr>
           <w:ilvl w:val="0"/>
-          <w:numId w:val="37"/>
+          <w:numId w:val="34"/>
         </w:numPr>
         <w:shd w:val="clear" w:color="auto" w:fill="FFFFFF" w:themeFill="background1"/>
         <w:spacing w:before="60" w:beforeAutospacing="0" w:after="180" w:afterAutospacing="0" w:line="360" w:lineRule="auto"/>
@@ -38042,7 +37104,7 @@
         <w:pStyle w:val="11"/>
         <w:numPr>
           <w:ilvl w:val="0"/>
-          <w:numId w:val="37"/>
+          <w:numId w:val="34"/>
         </w:numPr>
         <w:shd w:val="clear" w:color="auto" w:fill="FFFFFF" w:themeFill="background1"/>
         <w:spacing w:before="60" w:beforeAutospacing="0" w:after="180" w:afterAutospacing="0" w:line="360" w:lineRule="auto"/>
@@ -38082,7 +37144,7 @@
         <w:pStyle w:val="11"/>
         <w:numPr>
           <w:ilvl w:val="0"/>
-          <w:numId w:val="37"/>
+          <w:numId w:val="34"/>
         </w:numPr>
         <w:shd w:val="clear" w:color="auto" w:fill="FFFFFF" w:themeFill="background1"/>
         <w:spacing w:before="60" w:beforeAutospacing="0" w:after="180" w:afterAutospacing="0" w:line="360" w:lineRule="auto"/>
@@ -38177,7 +37239,7 @@
         <w:pStyle w:val="11"/>
         <w:numPr>
           <w:ilvl w:val="0"/>
-          <w:numId w:val="38"/>
+          <w:numId w:val="35"/>
         </w:numPr>
         <w:shd w:val="clear" w:color="auto" w:fill="FFF5EB"/>
         <w:spacing w:before="0" w:beforeAutospacing="0" w:after="180" w:afterAutospacing="0" w:line="360" w:lineRule="auto"/>
@@ -38217,7 +37279,7 @@
         <w:pStyle w:val="11"/>
         <w:numPr>
           <w:ilvl w:val="0"/>
-          <w:numId w:val="38"/>
+          <w:numId w:val="35"/>
         </w:numPr>
         <w:shd w:val="clear" w:color="auto" w:fill="FFF5EB"/>
         <w:spacing w:before="60" w:beforeAutospacing="0" w:after="0" w:afterAutospacing="0" w:line="360" w:lineRule="auto"/>
@@ -40398,92 +39460,6 @@
     </w:lvl>
   </w:abstractNum>
   <w:abstractNum w:abstractNumId="21">
-    <w:nsid w:val="4825C2A7"/>
-    <w:multiLevelType w:val="multilevel"/>
-    <w:tmpl w:val="4825C2A7"/>
-    <w:lvl w:ilvl="0" w:tentative="0">
-      <w:start w:val="1"/>
-      <w:numFmt w:val="decimal"/>
-      <w:lvlText w:val="%1."/>
-      <w:lvlJc w:val="left"/>
-      <w:pPr>
-        <w:ind w:left="720" w:hanging="360"/>
-      </w:pPr>
-    </w:lvl>
-    <w:lvl w:ilvl="1" w:tentative="0">
-      <w:start w:val="1"/>
-      <w:numFmt w:val="lowerLetter"/>
-      <w:lvlText w:val="%2."/>
-      <w:lvlJc w:val="left"/>
-      <w:pPr>
-        <w:ind w:left="1440" w:hanging="360"/>
-      </w:pPr>
-    </w:lvl>
-    <w:lvl w:ilvl="2" w:tentative="0">
-      <w:start w:val="1"/>
-      <w:numFmt w:val="lowerRoman"/>
-      <w:lvlText w:val="%3."/>
-      <w:lvlJc w:val="right"/>
-      <w:pPr>
-        <w:ind w:left="2160" w:hanging="180"/>
-      </w:pPr>
-    </w:lvl>
-    <w:lvl w:ilvl="3" w:tentative="0">
-      <w:start w:val="1"/>
-      <w:numFmt w:val="decimal"/>
-      <w:lvlText w:val="%4."/>
-      <w:lvlJc w:val="left"/>
-      <w:pPr>
-        <w:ind w:left="2880" w:hanging="360"/>
-      </w:pPr>
-    </w:lvl>
-    <w:lvl w:ilvl="4" w:tentative="0">
-      <w:start w:val="1"/>
-      <w:numFmt w:val="lowerLetter"/>
-      <w:lvlText w:val="%5."/>
-      <w:lvlJc w:val="left"/>
-      <w:pPr>
-        <w:ind w:left="3600" w:hanging="360"/>
-      </w:pPr>
-    </w:lvl>
-    <w:lvl w:ilvl="5" w:tentative="0">
-      <w:start w:val="1"/>
-      <w:numFmt w:val="lowerRoman"/>
-      <w:lvlText w:val="%6."/>
-      <w:lvlJc w:val="right"/>
-      <w:pPr>
-        <w:ind w:left="4320" w:hanging="180"/>
-      </w:pPr>
-    </w:lvl>
-    <w:lvl w:ilvl="6" w:tentative="0">
-      <w:start w:val="1"/>
-      <w:numFmt w:val="decimal"/>
-      <w:lvlText w:val="%7."/>
-      <w:lvlJc w:val="left"/>
-      <w:pPr>
-        <w:ind w:left="5040" w:hanging="360"/>
-      </w:pPr>
-    </w:lvl>
-    <w:lvl w:ilvl="7" w:tentative="0">
-      <w:start w:val="1"/>
-      <w:numFmt w:val="lowerLetter"/>
-      <w:lvlText w:val="%8."/>
-      <w:lvlJc w:val="left"/>
-      <w:pPr>
-        <w:ind w:left="5760" w:hanging="360"/>
-      </w:pPr>
-    </w:lvl>
-    <w:lvl w:ilvl="8" w:tentative="0">
-      <w:start w:val="1"/>
-      <w:numFmt w:val="lowerRoman"/>
-      <w:lvlText w:val="%9."/>
-      <w:lvlJc w:val="right"/>
-      <w:pPr>
-        <w:ind w:left="6480" w:hanging="180"/>
-      </w:pPr>
-    </w:lvl>
-  </w:abstractNum>
-  <w:abstractNum w:abstractNumId="22">
     <w:nsid w:val="5256E9DA"/>
     <w:multiLevelType w:val="multilevel"/>
     <w:tmpl w:val="5256E9DA"/>
@@ -40569,7 +39545,7 @@
       </w:pPr>
     </w:lvl>
   </w:abstractNum>
-  <w:abstractNum w:abstractNumId="23">
+  <w:abstractNum w:abstractNumId="22">
     <w:nsid w:val="56793AD4"/>
     <w:multiLevelType w:val="multilevel"/>
     <w:tmpl w:val="56793AD4"/>
@@ -40655,7 +39631,7 @@
       </w:pPr>
     </w:lvl>
   </w:abstractNum>
-  <w:abstractNum w:abstractNumId="24">
+  <w:abstractNum w:abstractNumId="23">
     <w:nsid w:val="5AF59FC5"/>
     <w:multiLevelType w:val="multilevel"/>
     <w:tmpl w:val="5AF59FC5"/>
@@ -40741,7 +39717,7 @@
       </w:pPr>
     </w:lvl>
   </w:abstractNum>
-  <w:abstractNum w:abstractNumId="25">
+  <w:abstractNum w:abstractNumId="24">
     <w:nsid w:val="5B6EB7C6"/>
     <w:multiLevelType w:val="multilevel"/>
     <w:tmpl w:val="5B6EB7C6"/>
@@ -40827,7 +39803,7 @@
       </w:pPr>
     </w:lvl>
   </w:abstractNum>
-  <w:abstractNum w:abstractNumId="26">
+  <w:abstractNum w:abstractNumId="25">
     <w:nsid w:val="5EE38526"/>
     <w:multiLevelType w:val="multilevel"/>
     <w:tmpl w:val="5EE38526"/>
@@ -40913,7 +39889,7 @@
       </w:pPr>
     </w:lvl>
   </w:abstractNum>
-  <w:abstractNum w:abstractNumId="27">
+  <w:abstractNum w:abstractNumId="26">
     <w:nsid w:val="605F10D9"/>
     <w:multiLevelType w:val="multilevel"/>
     <w:tmpl w:val="605F10D9"/>
@@ -40999,7 +39975,7 @@
       </w:pPr>
     </w:lvl>
   </w:abstractNum>
-  <w:abstractNum w:abstractNumId="28">
+  <w:abstractNum w:abstractNumId="27">
     <w:nsid w:val="62AB327E"/>
     <w:multiLevelType w:val="multilevel"/>
     <w:tmpl w:val="62AB327E"/>
@@ -41112,7 +40088,7 @@
       </w:rPr>
     </w:lvl>
   </w:abstractNum>
-  <w:abstractNum w:abstractNumId="29">
+  <w:abstractNum w:abstractNumId="28">
     <w:nsid w:val="6884588B"/>
     <w:multiLevelType w:val="multilevel"/>
     <w:tmpl w:val="6884588B"/>
@@ -41225,7 +40201,7 @@
       </w:rPr>
     </w:lvl>
   </w:abstractNum>
-  <w:abstractNum w:abstractNumId="30">
+  <w:abstractNum w:abstractNumId="29">
     <w:nsid w:val="6BF782C4"/>
     <w:multiLevelType w:val="multilevel"/>
     <w:tmpl w:val="6BF782C4"/>
@@ -41311,93 +40287,7 @@
       </w:pPr>
     </w:lvl>
   </w:abstractNum>
-  <w:abstractNum w:abstractNumId="31">
-    <w:nsid w:val="6C5C90D6"/>
-    <w:multiLevelType w:val="multilevel"/>
-    <w:tmpl w:val="6C5C90D6"/>
-    <w:lvl w:ilvl="0" w:tentative="0">
-      <w:start w:val="1"/>
-      <w:numFmt w:val="decimal"/>
-      <w:lvlText w:val="%1."/>
-      <w:lvlJc w:val="left"/>
-      <w:pPr>
-        <w:ind w:left="720" w:hanging="360"/>
-      </w:pPr>
-    </w:lvl>
-    <w:lvl w:ilvl="1" w:tentative="0">
-      <w:start w:val="1"/>
-      <w:numFmt w:val="lowerLetter"/>
-      <w:lvlText w:val="%2."/>
-      <w:lvlJc w:val="left"/>
-      <w:pPr>
-        <w:ind w:left="1440" w:hanging="360"/>
-      </w:pPr>
-    </w:lvl>
-    <w:lvl w:ilvl="2" w:tentative="0">
-      <w:start w:val="1"/>
-      <w:numFmt w:val="lowerRoman"/>
-      <w:lvlText w:val="%3."/>
-      <w:lvlJc w:val="right"/>
-      <w:pPr>
-        <w:ind w:left="2160" w:hanging="180"/>
-      </w:pPr>
-    </w:lvl>
-    <w:lvl w:ilvl="3" w:tentative="0">
-      <w:start w:val="1"/>
-      <w:numFmt w:val="decimal"/>
-      <w:lvlText w:val="%4."/>
-      <w:lvlJc w:val="left"/>
-      <w:pPr>
-        <w:ind w:left="2880" w:hanging="360"/>
-      </w:pPr>
-    </w:lvl>
-    <w:lvl w:ilvl="4" w:tentative="0">
-      <w:start w:val="1"/>
-      <w:numFmt w:val="lowerLetter"/>
-      <w:lvlText w:val="%5."/>
-      <w:lvlJc w:val="left"/>
-      <w:pPr>
-        <w:ind w:left="3600" w:hanging="360"/>
-      </w:pPr>
-    </w:lvl>
-    <w:lvl w:ilvl="5" w:tentative="0">
-      <w:start w:val="1"/>
-      <w:numFmt w:val="lowerRoman"/>
-      <w:lvlText w:val="%6."/>
-      <w:lvlJc w:val="right"/>
-      <w:pPr>
-        <w:ind w:left="4320" w:hanging="180"/>
-      </w:pPr>
-    </w:lvl>
-    <w:lvl w:ilvl="6" w:tentative="0">
-      <w:start w:val="1"/>
-      <w:numFmt w:val="decimal"/>
-      <w:lvlText w:val="%7."/>
-      <w:lvlJc w:val="left"/>
-      <w:pPr>
-        <w:ind w:left="5040" w:hanging="360"/>
-      </w:pPr>
-    </w:lvl>
-    <w:lvl w:ilvl="7" w:tentative="0">
-      <w:start w:val="1"/>
-      <w:numFmt w:val="lowerLetter"/>
-      <w:lvlText w:val="%8."/>
-      <w:lvlJc w:val="left"/>
-      <w:pPr>
-        <w:ind w:left="5760" w:hanging="360"/>
-      </w:pPr>
-    </w:lvl>
-    <w:lvl w:ilvl="8" w:tentative="0">
-      <w:start w:val="1"/>
-      <w:numFmt w:val="lowerRoman"/>
-      <w:lvlText w:val="%9."/>
-      <w:lvlJc w:val="right"/>
-      <w:pPr>
-        <w:ind w:left="6480" w:hanging="180"/>
-      </w:pPr>
-    </w:lvl>
-  </w:abstractNum>
-  <w:abstractNum w:abstractNumId="32">
+  <w:abstractNum w:abstractNumId="30">
     <w:nsid w:val="6E364262"/>
     <w:multiLevelType w:val="multilevel"/>
     <w:tmpl w:val="6E364262"/>
@@ -41510,7 +40400,7 @@
       </w:rPr>
     </w:lvl>
   </w:abstractNum>
-  <w:abstractNum w:abstractNumId="33">
+  <w:abstractNum w:abstractNumId="31">
     <w:nsid w:val="6ED5CD12"/>
     <w:multiLevelType w:val="multilevel"/>
     <w:tmpl w:val="6ED5CD12"/>
@@ -41596,7 +40486,7 @@
       </w:pPr>
     </w:lvl>
   </w:abstractNum>
-  <w:abstractNum w:abstractNumId="34">
+  <w:abstractNum w:abstractNumId="32">
     <w:nsid w:val="70B56C3F"/>
     <w:multiLevelType w:val="multilevel"/>
     <w:tmpl w:val="70B56C3F"/>
@@ -41709,93 +40599,7 @@
       </w:rPr>
     </w:lvl>
   </w:abstractNum>
-  <w:abstractNum w:abstractNumId="35">
-    <w:nsid w:val="743B0D78"/>
-    <w:multiLevelType w:val="multilevel"/>
-    <w:tmpl w:val="743B0D78"/>
-    <w:lvl w:ilvl="0" w:tentative="0">
-      <w:start w:val="2"/>
-      <w:numFmt w:val="decimal"/>
-      <w:lvlText w:val="%1."/>
-      <w:lvlJc w:val="left"/>
-      <w:pPr>
-        <w:ind w:left="720" w:hanging="360"/>
-      </w:pPr>
-    </w:lvl>
-    <w:lvl w:ilvl="1" w:tentative="0">
-      <w:start w:val="1"/>
-      <w:numFmt w:val="lowerLetter"/>
-      <w:lvlText w:val="%2."/>
-      <w:lvlJc w:val="left"/>
-      <w:pPr>
-        <w:ind w:left="1440" w:hanging="360"/>
-      </w:pPr>
-    </w:lvl>
-    <w:lvl w:ilvl="2" w:tentative="0">
-      <w:start w:val="1"/>
-      <w:numFmt w:val="lowerRoman"/>
-      <w:lvlText w:val="%3."/>
-      <w:lvlJc w:val="right"/>
-      <w:pPr>
-        <w:ind w:left="2160" w:hanging="180"/>
-      </w:pPr>
-    </w:lvl>
-    <w:lvl w:ilvl="3" w:tentative="0">
-      <w:start w:val="1"/>
-      <w:numFmt w:val="decimal"/>
-      <w:lvlText w:val="%4."/>
-      <w:lvlJc w:val="left"/>
-      <w:pPr>
-        <w:ind w:left="2880" w:hanging="360"/>
-      </w:pPr>
-    </w:lvl>
-    <w:lvl w:ilvl="4" w:tentative="0">
-      <w:start w:val="1"/>
-      <w:numFmt w:val="lowerLetter"/>
-      <w:lvlText w:val="%5."/>
-      <w:lvlJc w:val="left"/>
-      <w:pPr>
-        <w:ind w:left="3600" w:hanging="360"/>
-      </w:pPr>
-    </w:lvl>
-    <w:lvl w:ilvl="5" w:tentative="0">
-      <w:start w:val="1"/>
-      <w:numFmt w:val="lowerRoman"/>
-      <w:lvlText w:val="%6."/>
-      <w:lvlJc w:val="right"/>
-      <w:pPr>
-        <w:ind w:left="4320" w:hanging="180"/>
-      </w:pPr>
-    </w:lvl>
-    <w:lvl w:ilvl="6" w:tentative="0">
-      <w:start w:val="1"/>
-      <w:numFmt w:val="decimal"/>
-      <w:lvlText w:val="%7."/>
-      <w:lvlJc w:val="left"/>
-      <w:pPr>
-        <w:ind w:left="5040" w:hanging="360"/>
-      </w:pPr>
-    </w:lvl>
-    <w:lvl w:ilvl="7" w:tentative="0">
-      <w:start w:val="1"/>
-      <w:numFmt w:val="lowerLetter"/>
-      <w:lvlText w:val="%8."/>
-      <w:lvlJc w:val="left"/>
-      <w:pPr>
-        <w:ind w:left="5760" w:hanging="360"/>
-      </w:pPr>
-    </w:lvl>
-    <w:lvl w:ilvl="8" w:tentative="0">
-      <w:start w:val="1"/>
-      <w:numFmt w:val="lowerRoman"/>
-      <w:lvlText w:val="%9."/>
-      <w:lvlJc w:val="right"/>
-      <w:pPr>
-        <w:ind w:left="6480" w:hanging="180"/>
-      </w:pPr>
-    </w:lvl>
-  </w:abstractNum>
-  <w:abstractNum w:abstractNumId="36">
+  <w:abstractNum w:abstractNumId="33">
     <w:nsid w:val="749D0B3E"/>
     <w:multiLevelType w:val="multilevel"/>
     <w:tmpl w:val="749D0B3E"/>
@@ -41881,7 +40685,7 @@
       </w:pPr>
     </w:lvl>
   </w:abstractNum>
-  <w:abstractNum w:abstractNumId="37">
+  <w:abstractNum w:abstractNumId="34">
     <w:nsid w:val="7FAE103A"/>
     <w:multiLevelType w:val="multilevel"/>
     <w:tmpl w:val="7FAE103A"/>
@@ -42013,7 +40817,7 @@
     <w:abstractNumId w:val="6"/>
   </w:num>
   <w:num w:numId="7">
-    <w:abstractNumId w:val="29"/>
+    <w:abstractNumId w:val="28"/>
   </w:num>
   <w:num w:numId="8">
     <w:abstractNumId w:val="5"/>
@@ -42025,16 +40829,16 @@
     <w:abstractNumId w:val="11"/>
   </w:num>
   <w:num w:numId="11">
-    <w:abstractNumId w:val="37"/>
+    <w:abstractNumId w:val="34"/>
   </w:num>
   <w:num w:numId="12">
     <w:abstractNumId w:val="8"/>
   </w:num>
   <w:num w:numId="13">
-    <w:abstractNumId w:val="30"/>
+    <w:abstractNumId w:val="29"/>
   </w:num>
   <w:num w:numId="14">
-    <w:abstractNumId w:val="27"/>
+    <w:abstractNumId w:val="26"/>
   </w:num>
   <w:num w:numId="15">
     <w:abstractNumId w:val="12"/>
@@ -42049,63 +40853,54 @@
     <w:abstractNumId w:val="31"/>
   </w:num>
   <w:num w:numId="19">
-    <w:abstractNumId w:val="35"/>
+    <w:abstractNumId w:val="23"/>
   </w:num>
   <w:num w:numId="20">
+    <w:abstractNumId w:val="13"/>
+  </w:num>
+  <w:num w:numId="21">
+    <w:abstractNumId w:val="25"/>
+  </w:num>
+  <w:num w:numId="22">
+    <w:abstractNumId w:val="3"/>
+  </w:num>
+  <w:num w:numId="23">
+    <w:abstractNumId w:val="33"/>
+  </w:num>
+  <w:num w:numId="24">
+    <w:abstractNumId w:val="22"/>
+  </w:num>
+  <w:num w:numId="25">
+    <w:abstractNumId w:val="32"/>
+  </w:num>
+  <w:num w:numId="26">
+    <w:abstractNumId w:val="27"/>
+  </w:num>
+  <w:num w:numId="27">
+    <w:abstractNumId w:val="2"/>
+  </w:num>
+  <w:num w:numId="28">
+    <w:abstractNumId w:val="0"/>
+  </w:num>
+  <w:num w:numId="29">
+    <w:abstractNumId w:val="30"/>
+  </w:num>
+  <w:num w:numId="30">
+    <w:abstractNumId w:val="10"/>
+  </w:num>
+  <w:num w:numId="31">
+    <w:abstractNumId w:val="15"/>
+  </w:num>
+  <w:num w:numId="32">
     <w:abstractNumId w:val="21"/>
   </w:num>
-  <w:num w:numId="21">
-    <w:abstractNumId w:val="33"/>
-  </w:num>
-  <w:num w:numId="22">
+  <w:num w:numId="33">
     <w:abstractNumId w:val="24"/>
   </w:num>
-  <w:num w:numId="23">
-    <w:abstractNumId w:val="13"/>
-  </w:num>
-  <w:num w:numId="24">
-    <w:abstractNumId w:val="26"/>
-  </w:num>
-  <w:num w:numId="25">
-    <w:abstractNumId w:val="3"/>
-  </w:num>
-  <w:num w:numId="26">
-    <w:abstractNumId w:val="36"/>
-  </w:num>
-  <w:num w:numId="27">
-    <w:abstractNumId w:val="23"/>
-  </w:num>
-  <w:num w:numId="28">
-    <w:abstractNumId w:val="34"/>
-  </w:num>
-  <w:num w:numId="29">
-    <w:abstractNumId w:val="28"/>
-  </w:num>
-  <w:num w:numId="30">
-    <w:abstractNumId w:val="2"/>
-  </w:num>
-  <w:num w:numId="31">
-    <w:abstractNumId w:val="0"/>
-  </w:num>
-  <w:num w:numId="32">
-    <w:abstractNumId w:val="32"/>
-  </w:num>
-  <w:num w:numId="33">
-    <w:abstractNumId w:val="10"/>
-  </w:num>
   <w:num w:numId="34">
-    <w:abstractNumId w:val="15"/>
+    <w:abstractNumId w:val="19"/>
   </w:num>
   <w:num w:numId="35">
-    <w:abstractNumId w:val="22"/>
-  </w:num>
-  <w:num w:numId="36">
-    <w:abstractNumId w:val="25"/>
-  </w:num>
-  <w:num w:numId="37">
-    <w:abstractNumId w:val="19"/>
-  </w:num>
-  <w:num w:numId="38">
     <w:abstractNumId w:val="4"/>
   </w:num>
 </w:numbering>

</xml_diff>